<commit_message>
Se añade la parte de acceso a base de datos (bloque Historial de consultas)
</commit_message>
<xml_diff>
--- a/MyFitArena_Memoria_v2.docx
+++ b/MyFitArena_Memoria_v2.docx
@@ -28,12 +28,6 @@
         <w:gridCol w:w="9638"/>
       </w:tblGrid>
       <w:tr>
-        <w:tblPrEx>
-          <w:tblCellMar>
-            <w:top w:w="0" w:type="dxa"/>
-            <w:bottom w:w="0" w:type="dxa"/>
-          </w:tblCellMar>
-        </w:tblPrEx>
         <w:tc>
           <w:tcPr>
             <w:tcW w:w="9638" w:type="dxa"/>
@@ -149,12 +143,6 @@
         <w:gridCol w:w="9638"/>
       </w:tblGrid>
       <w:tr>
-        <w:tblPrEx>
-          <w:tblCellMar>
-            <w:top w:w="0" w:type="dxa"/>
-            <w:bottom w:w="0" w:type="dxa"/>
-          </w:tblCellMar>
-        </w:tblPrEx>
         <w:tc>
           <w:tcPr>
             <w:tcW w:w="9638" w:type="dxa"/>
@@ -3881,7 +3869,43 @@
         <w:rPr>
           <w:color w:val="000000"/>
         </w:rPr>
-        <w:t>My Fit Arena es una aplicación de gestión deportiva desarrollada como proyecto intermodular de 1.º de DAM. La aplicación integra una página web corporativa, una base de datos relacional en PostgreSQL y una aplicación de escritorio en Java con interfaz gráfica, siguiendo la arquitectura Modelo-Vista-Controlador (MVC).</w:t>
+        <w:t>My Fit Arena es una aplicación de gestión deportiva</w:t>
+      </w:r>
+      <w:r>
+        <w:rPr>
+          <w:color w:val="000000"/>
+        </w:rPr>
+        <w:t>,</w:t>
+      </w:r>
+      <w:r>
+        <w:rPr>
+          <w:color w:val="000000"/>
+        </w:rPr>
+        <w:t xml:space="preserve"> </w:t>
+      </w:r>
+      <w:r>
+        <w:rPr>
+          <w:color w:val="000000"/>
+        </w:rPr>
+        <w:t>l</w:t>
+      </w:r>
+      <w:r>
+        <w:rPr>
+          <w:color w:val="000000"/>
+        </w:rPr>
+        <w:t xml:space="preserve">a aplicación </w:t>
+      </w:r>
+      <w:r>
+        <w:rPr>
+          <w:color w:val="000000"/>
+        </w:rPr>
+        <w:t xml:space="preserve">contiene </w:t>
+      </w:r>
+      <w:r>
+        <w:rPr>
+          <w:color w:val="000000"/>
+        </w:rPr>
+        <w:t>una página web corporativa, una base de datos relacional en PostgreSQL y una aplicación de escritorio en Java con interfaz gráfica, siguiendo la arquitectura Modelo-Vista-Controlador (MVC).</w:t>
       </w:r>
     </w:p>
     <w:p>
@@ -4056,7 +4080,19 @@
         <w:rPr>
           <w:color w:val="000000"/>
         </w:rPr>
-        <w:t>Capa de presentación web: HTML5, CSS3 y JavaScript puro.</w:t>
+        <w:t>Capa de presentación web: HTML5, CSS3 y JavaScrip</w:t>
+      </w:r>
+      <w:r>
+        <w:rPr>
+          <w:color w:val="000000"/>
+        </w:rPr>
+        <w:t>t</w:t>
+      </w:r>
+      <w:r>
+        <w:rPr>
+          <w:color w:val="000000"/>
+        </w:rPr>
+        <w:t>.</w:t>
       </w:r>
     </w:p>
     <w:p>
@@ -4182,6 +4218,9 @@
         <w:spacing w:before="40"/>
       </w:pPr>
       <w:r>
+        <w:rPr>
+          <w:noProof/>
+        </w:rPr>
         <w:drawing>
           <wp:inline distT="0" distB="0" distL="0" distR="0" wp14:anchorId="5698E151" wp14:editId="0CF26F4C">
             <wp:extent cx="6120130" cy="4285615"/>
@@ -4262,12 +4301,6 @@
         <w:gridCol w:w="6138"/>
       </w:tblGrid>
       <w:tr>
-        <w:tblPrEx>
-          <w:tblCellMar>
-            <w:top w:w="0" w:type="dxa"/>
-            <w:bottom w:w="0" w:type="dxa"/>
-          </w:tblCellMar>
-        </w:tblPrEx>
         <w:tc>
           <w:tcPr>
             <w:tcW w:w="3500" w:type="dxa"/>
@@ -4350,12 +4383,6 @@
         </w:tc>
       </w:tr>
       <w:tr>
-        <w:tblPrEx>
-          <w:tblCellMar>
-            <w:top w:w="0" w:type="dxa"/>
-            <w:bottom w:w="0" w:type="dxa"/>
-          </w:tblCellMar>
-        </w:tblPrEx>
         <w:tc>
           <w:tcPr>
             <w:tcW w:w="3500" w:type="dxa"/>
@@ -4438,12 +4465,6 @@
         </w:tc>
       </w:tr>
       <w:tr>
-        <w:tblPrEx>
-          <w:tblCellMar>
-            <w:top w:w="0" w:type="dxa"/>
-            <w:bottom w:w="0" w:type="dxa"/>
-          </w:tblCellMar>
-        </w:tblPrEx>
         <w:tc>
           <w:tcPr>
             <w:tcW w:w="3500" w:type="dxa"/>
@@ -4528,12 +4549,6 @@
         </w:tc>
       </w:tr>
       <w:tr>
-        <w:tblPrEx>
-          <w:tblCellMar>
-            <w:top w:w="0" w:type="dxa"/>
-            <w:bottom w:w="0" w:type="dxa"/>
-          </w:tblCellMar>
-        </w:tblPrEx>
         <w:tc>
           <w:tcPr>
             <w:tcW w:w="3500" w:type="dxa"/>
@@ -4618,12 +4633,6 @@
         </w:tc>
       </w:tr>
       <w:tr>
-        <w:tblPrEx>
-          <w:tblCellMar>
-            <w:top w:w="0" w:type="dxa"/>
-            <w:bottom w:w="0" w:type="dxa"/>
-          </w:tblCellMar>
-        </w:tblPrEx>
         <w:tc>
           <w:tcPr>
             <w:tcW w:w="3500" w:type="dxa"/>
@@ -4708,12 +4717,6 @@
         </w:tc>
       </w:tr>
       <w:tr>
-        <w:tblPrEx>
-          <w:tblCellMar>
-            <w:top w:w="0" w:type="dxa"/>
-            <w:bottom w:w="0" w:type="dxa"/>
-          </w:tblCellMar>
-        </w:tblPrEx>
         <w:tc>
           <w:tcPr>
             <w:tcW w:w="3500" w:type="dxa"/>
@@ -4798,12 +4801,6 @@
         </w:tc>
       </w:tr>
       <w:tr>
-        <w:tblPrEx>
-          <w:tblCellMar>
-            <w:top w:w="0" w:type="dxa"/>
-            <w:bottom w:w="0" w:type="dxa"/>
-          </w:tblCellMar>
-        </w:tblPrEx>
         <w:tc>
           <w:tcPr>
             <w:tcW w:w="3500" w:type="dxa"/>
@@ -4886,12 +4883,6 @@
         </w:tc>
       </w:tr>
       <w:tr>
-        <w:tblPrEx>
-          <w:tblCellMar>
-            <w:top w:w="0" w:type="dxa"/>
-            <w:bottom w:w="0" w:type="dxa"/>
-          </w:tblCellMar>
-        </w:tblPrEx>
         <w:tc>
           <w:tcPr>
             <w:tcW w:w="3500" w:type="dxa"/>
@@ -5002,12 +4993,6 @@
         </w:tc>
       </w:tr>
       <w:tr>
-        <w:tblPrEx>
-          <w:tblCellMar>
-            <w:top w:w="0" w:type="dxa"/>
-            <w:bottom w:w="0" w:type="dxa"/>
-          </w:tblCellMar>
-        </w:tblPrEx>
         <w:tc>
           <w:tcPr>
             <w:tcW w:w="3500" w:type="dxa"/>
@@ -5084,7 +5069,43 @@
                 <w:sz w:val="20"/>
                 <w:szCs w:val="20"/>
               </w:rPr>
-              <w:t xml:space="preserve">nombre, descripcion, fechaCreacion, </w:t>
+              <w:t xml:space="preserve">nombre, </w:t>
+            </w:r>
+            <w:proofErr w:type="spellStart"/>
+            <w:r>
+              <w:rPr>
+                <w:color w:val="000000"/>
+                <w:sz w:val="20"/>
+                <w:szCs w:val="20"/>
+              </w:rPr>
+              <w:t>descripcion</w:t>
+            </w:r>
+            <w:proofErr w:type="spellEnd"/>
+            <w:r>
+              <w:rPr>
+                <w:color w:val="000000"/>
+                <w:sz w:val="20"/>
+                <w:szCs w:val="20"/>
+              </w:rPr>
+              <w:t xml:space="preserve">, </w:t>
+            </w:r>
+            <w:proofErr w:type="spellStart"/>
+            <w:r>
+              <w:rPr>
+                <w:color w:val="000000"/>
+                <w:sz w:val="20"/>
+                <w:szCs w:val="20"/>
+              </w:rPr>
+              <w:t>fechaCreacion</w:t>
+            </w:r>
+            <w:proofErr w:type="spellEnd"/>
+            <w:r>
+              <w:rPr>
+                <w:color w:val="000000"/>
+                <w:sz w:val="20"/>
+                <w:szCs w:val="20"/>
+              </w:rPr>
+              <w:t xml:space="preserve">, </w:t>
             </w:r>
             <w:proofErr w:type="spellStart"/>
             <w:r>
@@ -5100,12 +5121,6 @@
         </w:tc>
       </w:tr>
       <w:tr>
-        <w:tblPrEx>
-          <w:tblCellMar>
-            <w:top w:w="0" w:type="dxa"/>
-            <w:bottom w:w="0" w:type="dxa"/>
-          </w:tblCellMar>
-        </w:tblPrEx>
         <w:tc>
           <w:tcPr>
             <w:tcW w:w="3500" w:type="dxa"/>
@@ -5209,12 +5224,6 @@
         </w:tc>
       </w:tr>
       <w:tr>
-        <w:tblPrEx>
-          <w:tblCellMar>
-            <w:top w:w="0" w:type="dxa"/>
-            <w:bottom w:w="0" w:type="dxa"/>
-          </w:tblCellMar>
-        </w:tblPrEx>
         <w:tc>
           <w:tcPr>
             <w:tcW w:w="3500" w:type="dxa"/>
@@ -5291,7 +5300,25 @@
                 <w:sz w:val="20"/>
                 <w:szCs w:val="20"/>
               </w:rPr>
-              <w:t xml:space="preserve">tipo, descripcion, </w:t>
+              <w:t xml:space="preserve">tipo, </w:t>
+            </w:r>
+            <w:proofErr w:type="spellStart"/>
+            <w:r>
+              <w:rPr>
+                <w:color w:val="000000"/>
+                <w:sz w:val="20"/>
+                <w:szCs w:val="20"/>
+              </w:rPr>
+              <w:t>descripcion</w:t>
+            </w:r>
+            <w:proofErr w:type="spellEnd"/>
+            <w:r>
+              <w:rPr>
+                <w:color w:val="000000"/>
+                <w:sz w:val="20"/>
+                <w:szCs w:val="20"/>
+              </w:rPr>
+              <w:t xml:space="preserve">, </w:t>
             </w:r>
             <w:proofErr w:type="spellStart"/>
             <w:r>
@@ -5325,12 +5352,6 @@
         </w:tc>
       </w:tr>
       <w:tr>
-        <w:tblPrEx>
-          <w:tblCellMar>
-            <w:top w:w="0" w:type="dxa"/>
-            <w:bottom w:w="0" w:type="dxa"/>
-          </w:tblCellMar>
-        </w:tblPrEx>
         <w:tc>
           <w:tcPr>
             <w:tcW w:w="3500" w:type="dxa"/>
@@ -5445,12 +5466,6 @@
         </w:tc>
       </w:tr>
       <w:tr>
-        <w:tblPrEx>
-          <w:tblCellMar>
-            <w:top w:w="0" w:type="dxa"/>
-            <w:bottom w:w="0" w:type="dxa"/>
-          </w:tblCellMar>
-        </w:tblPrEx>
         <w:tc>
           <w:tcPr>
             <w:tcW w:w="3500" w:type="dxa"/>
@@ -5511,12 +5526,6 @@
         </w:tc>
       </w:tr>
       <w:tr>
-        <w:tblPrEx>
-          <w:tblCellMar>
-            <w:top w:w="0" w:type="dxa"/>
-            <w:bottom w:w="0" w:type="dxa"/>
-          </w:tblCellMar>
-        </w:tblPrEx>
         <w:tc>
           <w:tcPr>
             <w:tcW w:w="3500" w:type="dxa"/>
@@ -5565,64 +5574,9 @@
                 <w:sz w:val="20"/>
                 <w:szCs w:val="20"/>
               </w:rPr>
-              <w:t>, dni_usuario) PK compuesta</w:t>
-            </w:r>
-          </w:p>
-        </w:tc>
-        <w:tc>
-          <w:tcPr>
-            <w:tcW w:w="6138" w:type="dxa"/>
-            <w:tcBorders>
-              <w:top w:val="single" w:sz="1" w:space="0" w:color="CCCCCC"/>
-              <w:left w:val="single" w:sz="1" w:space="0" w:color="CCCCCC"/>
-              <w:bottom w:val="single" w:sz="1" w:space="0" w:color="CCCCCC"/>
-              <w:right w:val="single" w:sz="1" w:space="0" w:color="CCCCCC"/>
-            </w:tcBorders>
-            <w:shd w:val="clear" w:color="auto" w:fill="FFFFFF"/>
-            <w:tcMar>
-              <w:top w:w="80" w:type="dxa"/>
-              <w:left w:w="120" w:type="dxa"/>
-              <w:bottom w:w="80" w:type="dxa"/>
-              <w:right w:w="120" w:type="dxa"/>
-            </w:tcMar>
-          </w:tcPr>
-          <w:p>
-            <w:r>
-              <w:rPr>
-                <w:color w:val="000000"/>
-                <w:sz w:val="20"/>
-                <w:szCs w:val="20"/>
-              </w:rPr>
-              <w:t>Relación M:M Evento–Usuario</w:t>
-            </w:r>
-          </w:p>
-        </w:tc>
-      </w:tr>
-      <w:tr>
-        <w:tblPrEx>
-          <w:tblCellMar>
-            <w:top w:w="0" w:type="dxa"/>
-            <w:bottom w:w="0" w:type="dxa"/>
-          </w:tblCellMar>
-        </w:tblPrEx>
-        <w:tc>
-          <w:tcPr>
-            <w:tcW w:w="3500" w:type="dxa"/>
-            <w:tcBorders>
-              <w:top w:val="single" w:sz="1" w:space="0" w:color="CCCCCC"/>
-              <w:left w:val="single" w:sz="1" w:space="0" w:color="CCCCCC"/>
-              <w:bottom w:val="single" w:sz="1" w:space="0" w:color="CCCCCC"/>
-              <w:right w:val="single" w:sz="1" w:space="0" w:color="CCCCCC"/>
-            </w:tcBorders>
-            <w:shd w:val="clear" w:color="auto" w:fill="F2F2F2"/>
-            <w:tcMar>
-              <w:top w:w="80" w:type="dxa"/>
-              <w:left w:w="120" w:type="dxa"/>
-              <w:bottom w:w="80" w:type="dxa"/>
-              <w:right w:w="120" w:type="dxa"/>
-            </w:tcMar>
-          </w:tcPr>
-          <w:p>
+              <w:t xml:space="preserve">, </w:t>
+            </w:r>
+            <w:proofErr w:type="spellStart"/>
             <w:r>
               <w:rPr>
                 <w:b/>
@@ -5631,64 +5585,9 @@
                 <w:sz w:val="20"/>
                 <w:szCs w:val="20"/>
               </w:rPr>
-              <w:t>TENER_AMIGOS (amigo1, amigo2) PK compuesta</w:t>
-            </w:r>
-          </w:p>
-        </w:tc>
-        <w:tc>
-          <w:tcPr>
-            <w:tcW w:w="6138" w:type="dxa"/>
-            <w:tcBorders>
-              <w:top w:val="single" w:sz="1" w:space="0" w:color="CCCCCC"/>
-              <w:left w:val="single" w:sz="1" w:space="0" w:color="CCCCCC"/>
-              <w:bottom w:val="single" w:sz="1" w:space="0" w:color="CCCCCC"/>
-              <w:right w:val="single" w:sz="1" w:space="0" w:color="CCCCCC"/>
-            </w:tcBorders>
-            <w:shd w:val="clear" w:color="auto" w:fill="F2F2F2"/>
-            <w:tcMar>
-              <w:top w:w="80" w:type="dxa"/>
-              <w:left w:w="120" w:type="dxa"/>
-              <w:bottom w:w="80" w:type="dxa"/>
-              <w:right w:w="120" w:type="dxa"/>
-            </w:tcMar>
-          </w:tcPr>
-          <w:p>
-            <w:r>
-              <w:rPr>
-                <w:color w:val="000000"/>
-                <w:sz w:val="20"/>
-                <w:szCs w:val="20"/>
-              </w:rPr>
-              <w:t>Relación reflexiva M:M en Usuario</w:t>
-            </w:r>
-          </w:p>
-        </w:tc>
-      </w:tr>
-      <w:tr>
-        <w:tblPrEx>
-          <w:tblCellMar>
-            <w:top w:w="0" w:type="dxa"/>
-            <w:bottom w:w="0" w:type="dxa"/>
-          </w:tblCellMar>
-        </w:tblPrEx>
-        <w:tc>
-          <w:tcPr>
-            <w:tcW w:w="3500" w:type="dxa"/>
-            <w:tcBorders>
-              <w:top w:val="single" w:sz="1" w:space="0" w:color="CCCCCC"/>
-              <w:left w:val="single" w:sz="1" w:space="0" w:color="CCCCCC"/>
-              <w:bottom w:val="single" w:sz="1" w:space="0" w:color="CCCCCC"/>
-              <w:right w:val="single" w:sz="1" w:space="0" w:color="CCCCCC"/>
-            </w:tcBorders>
-            <w:shd w:val="clear" w:color="auto" w:fill="FFFFFF"/>
-            <w:tcMar>
-              <w:top w:w="80" w:type="dxa"/>
-              <w:left w:w="120" w:type="dxa"/>
-              <w:bottom w:w="80" w:type="dxa"/>
-              <w:right w:w="120" w:type="dxa"/>
-            </w:tcMar>
-          </w:tcPr>
-          <w:p>
+              <w:t>dni_usuario</w:t>
+            </w:r>
+            <w:proofErr w:type="spellEnd"/>
             <w:r>
               <w:rPr>
                 <w:b/>
@@ -5697,9 +5596,58 @@
                 <w:sz w:val="20"/>
                 <w:szCs w:val="20"/>
               </w:rPr>
-              <w:t>TENER (</w:t>
-            </w:r>
-            <w:proofErr w:type="spellStart"/>
+              <w:t>) PK compuesta</w:t>
+            </w:r>
+          </w:p>
+        </w:tc>
+        <w:tc>
+          <w:tcPr>
+            <w:tcW w:w="6138" w:type="dxa"/>
+            <w:tcBorders>
+              <w:top w:val="single" w:sz="1" w:space="0" w:color="CCCCCC"/>
+              <w:left w:val="single" w:sz="1" w:space="0" w:color="CCCCCC"/>
+              <w:bottom w:val="single" w:sz="1" w:space="0" w:color="CCCCCC"/>
+              <w:right w:val="single" w:sz="1" w:space="0" w:color="CCCCCC"/>
+            </w:tcBorders>
+            <w:shd w:val="clear" w:color="auto" w:fill="FFFFFF"/>
+            <w:tcMar>
+              <w:top w:w="80" w:type="dxa"/>
+              <w:left w:w="120" w:type="dxa"/>
+              <w:bottom w:w="80" w:type="dxa"/>
+              <w:right w:w="120" w:type="dxa"/>
+            </w:tcMar>
+          </w:tcPr>
+          <w:p>
+            <w:r>
+              <w:rPr>
+                <w:color w:val="000000"/>
+                <w:sz w:val="20"/>
+                <w:szCs w:val="20"/>
+              </w:rPr>
+              <w:t>Relación M:M Evento–Usuario</w:t>
+            </w:r>
+          </w:p>
+        </w:tc>
+      </w:tr>
+      <w:tr>
+        <w:tc>
+          <w:tcPr>
+            <w:tcW w:w="3500" w:type="dxa"/>
+            <w:tcBorders>
+              <w:top w:val="single" w:sz="1" w:space="0" w:color="CCCCCC"/>
+              <w:left w:val="single" w:sz="1" w:space="0" w:color="CCCCCC"/>
+              <w:bottom w:val="single" w:sz="1" w:space="0" w:color="CCCCCC"/>
+              <w:right w:val="single" w:sz="1" w:space="0" w:color="CCCCCC"/>
+            </w:tcBorders>
+            <w:shd w:val="clear" w:color="auto" w:fill="F2F2F2"/>
+            <w:tcMar>
+              <w:top w:w="80" w:type="dxa"/>
+              <w:left w:w="120" w:type="dxa"/>
+              <w:bottom w:w="80" w:type="dxa"/>
+              <w:right w:w="120" w:type="dxa"/>
+            </w:tcMar>
+          </w:tcPr>
+          <w:p>
             <w:r>
               <w:rPr>
                 <w:b/>
@@ -5708,9 +5656,58 @@
                 <w:sz w:val="20"/>
                 <w:szCs w:val="20"/>
               </w:rPr>
-              <w:t>cod_evento</w:t>
-            </w:r>
-            <w:proofErr w:type="spellEnd"/>
+              <w:t>TENER_AMIGOS (amigo1, amigo2) PK compuesta</w:t>
+            </w:r>
+          </w:p>
+        </w:tc>
+        <w:tc>
+          <w:tcPr>
+            <w:tcW w:w="6138" w:type="dxa"/>
+            <w:tcBorders>
+              <w:top w:val="single" w:sz="1" w:space="0" w:color="CCCCCC"/>
+              <w:left w:val="single" w:sz="1" w:space="0" w:color="CCCCCC"/>
+              <w:bottom w:val="single" w:sz="1" w:space="0" w:color="CCCCCC"/>
+              <w:right w:val="single" w:sz="1" w:space="0" w:color="CCCCCC"/>
+            </w:tcBorders>
+            <w:shd w:val="clear" w:color="auto" w:fill="F2F2F2"/>
+            <w:tcMar>
+              <w:top w:w="80" w:type="dxa"/>
+              <w:left w:w="120" w:type="dxa"/>
+              <w:bottom w:w="80" w:type="dxa"/>
+              <w:right w:w="120" w:type="dxa"/>
+            </w:tcMar>
+          </w:tcPr>
+          <w:p>
+            <w:r>
+              <w:rPr>
+                <w:color w:val="000000"/>
+                <w:sz w:val="20"/>
+                <w:szCs w:val="20"/>
+              </w:rPr>
+              <w:t>Relación reflexiva M:M en Usuario</w:t>
+            </w:r>
+          </w:p>
+        </w:tc>
+      </w:tr>
+      <w:tr>
+        <w:tc>
+          <w:tcPr>
+            <w:tcW w:w="3500" w:type="dxa"/>
+            <w:tcBorders>
+              <w:top w:val="single" w:sz="1" w:space="0" w:color="CCCCCC"/>
+              <w:left w:val="single" w:sz="1" w:space="0" w:color="CCCCCC"/>
+              <w:bottom w:val="single" w:sz="1" w:space="0" w:color="CCCCCC"/>
+              <w:right w:val="single" w:sz="1" w:space="0" w:color="CCCCCC"/>
+            </w:tcBorders>
+            <w:shd w:val="clear" w:color="auto" w:fill="FFFFFF"/>
+            <w:tcMar>
+              <w:top w:w="80" w:type="dxa"/>
+              <w:left w:w="120" w:type="dxa"/>
+              <w:bottom w:w="80" w:type="dxa"/>
+              <w:right w:w="120" w:type="dxa"/>
+            </w:tcMar>
+          </w:tcPr>
+          <w:p>
             <w:r>
               <w:rPr>
                 <w:b/>
@@ -5719,7 +5716,7 @@
                 <w:sz w:val="20"/>
                 <w:szCs w:val="20"/>
               </w:rPr>
-              <w:t xml:space="preserve">, </w:t>
+              <w:t>TENER (</w:t>
             </w:r>
             <w:proofErr w:type="spellStart"/>
             <w:r>
@@ -5730,7 +5727,7 @@
                 <w:sz w:val="20"/>
                 <w:szCs w:val="20"/>
               </w:rPr>
-              <w:t>cod_anuncio</w:t>
+              <w:t>cod_evento</w:t>
             </w:r>
             <w:proofErr w:type="spellEnd"/>
             <w:r>
@@ -5741,64 +5738,9 @@
                 <w:sz w:val="20"/>
                 <w:szCs w:val="20"/>
               </w:rPr>
-              <w:t>) PK compuesta</w:t>
-            </w:r>
-          </w:p>
-        </w:tc>
-        <w:tc>
-          <w:tcPr>
-            <w:tcW w:w="6138" w:type="dxa"/>
-            <w:tcBorders>
-              <w:top w:val="single" w:sz="1" w:space="0" w:color="CCCCCC"/>
-              <w:left w:val="single" w:sz="1" w:space="0" w:color="CCCCCC"/>
-              <w:bottom w:val="single" w:sz="1" w:space="0" w:color="CCCCCC"/>
-              <w:right w:val="single" w:sz="1" w:space="0" w:color="CCCCCC"/>
-            </w:tcBorders>
-            <w:shd w:val="clear" w:color="auto" w:fill="FFFFFF"/>
-            <w:tcMar>
-              <w:top w:w="80" w:type="dxa"/>
-              <w:left w:w="120" w:type="dxa"/>
-              <w:bottom w:w="80" w:type="dxa"/>
-              <w:right w:w="120" w:type="dxa"/>
-            </w:tcMar>
-          </w:tcPr>
-          <w:p>
-            <w:r>
-              <w:rPr>
-                <w:color w:val="000000"/>
-                <w:sz w:val="20"/>
-                <w:szCs w:val="20"/>
-              </w:rPr>
-              <w:t>Relación ternaria Evento–Anuncio–Club</w:t>
-            </w:r>
-          </w:p>
-        </w:tc>
-      </w:tr>
-      <w:tr>
-        <w:tblPrEx>
-          <w:tblCellMar>
-            <w:top w:w="0" w:type="dxa"/>
-            <w:bottom w:w="0" w:type="dxa"/>
-          </w:tblCellMar>
-        </w:tblPrEx>
-        <w:tc>
-          <w:tcPr>
-            <w:tcW w:w="3500" w:type="dxa"/>
-            <w:tcBorders>
-              <w:top w:val="single" w:sz="1" w:space="0" w:color="CCCCCC"/>
-              <w:left w:val="single" w:sz="1" w:space="0" w:color="CCCCCC"/>
-              <w:bottom w:val="single" w:sz="1" w:space="0" w:color="CCCCCC"/>
-              <w:right w:val="single" w:sz="1" w:space="0" w:color="CCCCCC"/>
-            </w:tcBorders>
-            <w:shd w:val="clear" w:color="auto" w:fill="F2F2F2"/>
-            <w:tcMar>
-              <w:top w:w="80" w:type="dxa"/>
-              <w:left w:w="120" w:type="dxa"/>
-              <w:bottom w:w="80" w:type="dxa"/>
-              <w:right w:w="120" w:type="dxa"/>
-            </w:tcMar>
-          </w:tcPr>
-          <w:p>
+              <w:t xml:space="preserve">, </w:t>
+            </w:r>
+            <w:proofErr w:type="spellStart"/>
             <w:r>
               <w:rPr>
                 <w:b/>
@@ -5807,9 +5749,9 @@
                 <w:sz w:val="20"/>
                 <w:szCs w:val="20"/>
               </w:rPr>
-              <w:t>RECOMENDACIONES (</w:t>
-            </w:r>
-            <w:proofErr w:type="spellStart"/>
+              <w:t>cod_anuncio</w:t>
+            </w:r>
+            <w:proofErr w:type="spellEnd"/>
             <w:r>
               <w:rPr>
                 <w:b/>
@@ -5818,9 +5760,58 @@
                 <w:sz w:val="20"/>
                 <w:szCs w:val="20"/>
               </w:rPr>
-              <w:t>codRecomendacion</w:t>
-            </w:r>
-            <w:proofErr w:type="spellEnd"/>
+              <w:t>) PK compuesta</w:t>
+            </w:r>
+          </w:p>
+        </w:tc>
+        <w:tc>
+          <w:tcPr>
+            <w:tcW w:w="6138" w:type="dxa"/>
+            <w:tcBorders>
+              <w:top w:val="single" w:sz="1" w:space="0" w:color="CCCCCC"/>
+              <w:left w:val="single" w:sz="1" w:space="0" w:color="CCCCCC"/>
+              <w:bottom w:val="single" w:sz="1" w:space="0" w:color="CCCCCC"/>
+              <w:right w:val="single" w:sz="1" w:space="0" w:color="CCCCCC"/>
+            </w:tcBorders>
+            <w:shd w:val="clear" w:color="auto" w:fill="FFFFFF"/>
+            <w:tcMar>
+              <w:top w:w="80" w:type="dxa"/>
+              <w:left w:w="120" w:type="dxa"/>
+              <w:bottom w:w="80" w:type="dxa"/>
+              <w:right w:w="120" w:type="dxa"/>
+            </w:tcMar>
+          </w:tcPr>
+          <w:p>
+            <w:r>
+              <w:rPr>
+                <w:color w:val="000000"/>
+                <w:sz w:val="20"/>
+                <w:szCs w:val="20"/>
+              </w:rPr>
+              <w:t>Relación ternaria Evento–Anuncio–Club</w:t>
+            </w:r>
+          </w:p>
+        </w:tc>
+      </w:tr>
+      <w:tr>
+        <w:tc>
+          <w:tcPr>
+            <w:tcW w:w="3500" w:type="dxa"/>
+            <w:tcBorders>
+              <w:top w:val="single" w:sz="1" w:space="0" w:color="CCCCCC"/>
+              <w:left w:val="single" w:sz="1" w:space="0" w:color="CCCCCC"/>
+              <w:bottom w:val="single" w:sz="1" w:space="0" w:color="CCCCCC"/>
+              <w:right w:val="single" w:sz="1" w:space="0" w:color="CCCCCC"/>
+            </w:tcBorders>
+            <w:shd w:val="clear" w:color="auto" w:fill="F2F2F2"/>
+            <w:tcMar>
+              <w:top w:w="80" w:type="dxa"/>
+              <w:left w:w="120" w:type="dxa"/>
+              <w:bottom w:w="80" w:type="dxa"/>
+              <w:right w:w="120" w:type="dxa"/>
+            </w:tcMar>
+          </w:tcPr>
+          <w:p>
             <w:r>
               <w:rPr>
                 <w:b/>
@@ -5829,64 +5820,9 @@
                 <w:sz w:val="20"/>
                 <w:szCs w:val="20"/>
               </w:rPr>
-              <w:t xml:space="preserve"> PK)</w:t>
-            </w:r>
-          </w:p>
-        </w:tc>
-        <w:tc>
-          <w:tcPr>
-            <w:tcW w:w="6138" w:type="dxa"/>
-            <w:tcBorders>
-              <w:top w:val="single" w:sz="1" w:space="0" w:color="CCCCCC"/>
-              <w:left w:val="single" w:sz="1" w:space="0" w:color="CCCCCC"/>
-              <w:bottom w:val="single" w:sz="1" w:space="0" w:color="CCCCCC"/>
-              <w:right w:val="single" w:sz="1" w:space="0" w:color="CCCCCC"/>
-            </w:tcBorders>
-            <w:shd w:val="clear" w:color="auto" w:fill="F2F2F2"/>
-            <w:tcMar>
-              <w:top w:w="80" w:type="dxa"/>
-              <w:left w:w="120" w:type="dxa"/>
-              <w:bottom w:w="80" w:type="dxa"/>
-              <w:right w:w="120" w:type="dxa"/>
-            </w:tcMar>
-          </w:tcPr>
-          <w:p>
-            <w:r>
-              <w:rPr>
-                <w:color w:val="000000"/>
-                <w:sz w:val="20"/>
-                <w:szCs w:val="20"/>
-              </w:rPr>
-              <w:t>descripcion, prioridad, FK compuesta a REALIZAR</w:t>
-            </w:r>
-          </w:p>
-        </w:tc>
-      </w:tr>
-      <w:tr>
-        <w:tblPrEx>
-          <w:tblCellMar>
-            <w:top w:w="0" w:type="dxa"/>
-            <w:bottom w:w="0" w:type="dxa"/>
-          </w:tblCellMar>
-        </w:tblPrEx>
-        <w:tc>
-          <w:tcPr>
-            <w:tcW w:w="3500" w:type="dxa"/>
-            <w:tcBorders>
-              <w:top w:val="single" w:sz="1" w:space="0" w:color="CCCCCC"/>
-              <w:left w:val="single" w:sz="1" w:space="0" w:color="CCCCCC"/>
-              <w:bottom w:val="single" w:sz="1" w:space="0" w:color="CCCCCC"/>
-              <w:right w:val="single" w:sz="1" w:space="0" w:color="CCCCCC"/>
-            </w:tcBorders>
-            <w:shd w:val="clear" w:color="auto" w:fill="FFFFFF"/>
-            <w:tcMar>
-              <w:top w:w="80" w:type="dxa"/>
-              <w:left w:w="120" w:type="dxa"/>
-              <w:bottom w:w="80" w:type="dxa"/>
-              <w:right w:w="120" w:type="dxa"/>
-            </w:tcMar>
-          </w:tcPr>
-          <w:p>
+              <w:t>RECOMENDACIONES (</w:t>
+            </w:r>
+            <w:proofErr w:type="spellStart"/>
             <w:r>
               <w:rPr>
                 <w:b/>
@@ -5895,9 +5831,9 @@
                 <w:sz w:val="20"/>
                 <w:szCs w:val="20"/>
               </w:rPr>
-              <w:t>LOGRO (</w:t>
-            </w:r>
-            <w:proofErr w:type="spellStart"/>
+              <w:t>codRecomendacion</w:t>
+            </w:r>
+            <w:proofErr w:type="spellEnd"/>
             <w:r>
               <w:rPr>
                 <w:b/>
@@ -5906,9 +5842,58 @@
                 <w:sz w:val="20"/>
                 <w:szCs w:val="20"/>
               </w:rPr>
-              <w:t>codLogro</w:t>
-            </w:r>
-            <w:proofErr w:type="spellEnd"/>
+              <w:t xml:space="preserve"> PK)</w:t>
+            </w:r>
+          </w:p>
+        </w:tc>
+        <w:tc>
+          <w:tcPr>
+            <w:tcW w:w="6138" w:type="dxa"/>
+            <w:tcBorders>
+              <w:top w:val="single" w:sz="1" w:space="0" w:color="CCCCCC"/>
+              <w:left w:val="single" w:sz="1" w:space="0" w:color="CCCCCC"/>
+              <w:bottom w:val="single" w:sz="1" w:space="0" w:color="CCCCCC"/>
+              <w:right w:val="single" w:sz="1" w:space="0" w:color="CCCCCC"/>
+            </w:tcBorders>
+            <w:shd w:val="clear" w:color="auto" w:fill="F2F2F2"/>
+            <w:tcMar>
+              <w:top w:w="80" w:type="dxa"/>
+              <w:left w:w="120" w:type="dxa"/>
+              <w:bottom w:w="80" w:type="dxa"/>
+              <w:right w:w="120" w:type="dxa"/>
+            </w:tcMar>
+          </w:tcPr>
+          <w:p>
+            <w:r>
+              <w:rPr>
+                <w:color w:val="000000"/>
+                <w:sz w:val="20"/>
+                <w:szCs w:val="20"/>
+              </w:rPr>
+              <w:t>descripcion, prioridad, FK compuesta a REALIZAR</w:t>
+            </w:r>
+          </w:p>
+        </w:tc>
+      </w:tr>
+      <w:tr>
+        <w:tc>
+          <w:tcPr>
+            <w:tcW w:w="3500" w:type="dxa"/>
+            <w:tcBorders>
+              <w:top w:val="single" w:sz="1" w:space="0" w:color="CCCCCC"/>
+              <w:left w:val="single" w:sz="1" w:space="0" w:color="CCCCCC"/>
+              <w:bottom w:val="single" w:sz="1" w:space="0" w:color="CCCCCC"/>
+              <w:right w:val="single" w:sz="1" w:space="0" w:color="CCCCCC"/>
+            </w:tcBorders>
+            <w:shd w:val="clear" w:color="auto" w:fill="FFFFFF"/>
+            <w:tcMar>
+              <w:top w:w="80" w:type="dxa"/>
+              <w:left w:w="120" w:type="dxa"/>
+              <w:bottom w:w="80" w:type="dxa"/>
+              <w:right w:w="120" w:type="dxa"/>
+            </w:tcMar>
+          </w:tcPr>
+          <w:p>
             <w:r>
               <w:rPr>
                 <w:b/>
@@ -5917,64 +5902,9 @@
                 <w:sz w:val="20"/>
                 <w:szCs w:val="20"/>
               </w:rPr>
-              <w:t xml:space="preserve"> PK)</w:t>
-            </w:r>
-          </w:p>
-        </w:tc>
-        <w:tc>
-          <w:tcPr>
-            <w:tcW w:w="6138" w:type="dxa"/>
-            <w:tcBorders>
-              <w:top w:val="single" w:sz="1" w:space="0" w:color="CCCCCC"/>
-              <w:left w:val="single" w:sz="1" w:space="0" w:color="CCCCCC"/>
-              <w:bottom w:val="single" w:sz="1" w:space="0" w:color="CCCCCC"/>
-              <w:right w:val="single" w:sz="1" w:space="0" w:color="CCCCCC"/>
-            </w:tcBorders>
-            <w:shd w:val="clear" w:color="auto" w:fill="FFFFFF"/>
-            <w:tcMar>
-              <w:top w:w="80" w:type="dxa"/>
-              <w:left w:w="120" w:type="dxa"/>
-              <w:bottom w:w="80" w:type="dxa"/>
-              <w:right w:w="120" w:type="dxa"/>
-            </w:tcMar>
-          </w:tcPr>
-          <w:p>
-            <w:r>
-              <w:rPr>
-                <w:color w:val="000000"/>
-                <w:sz w:val="20"/>
-                <w:szCs w:val="20"/>
-              </w:rPr>
-              <w:t>nombre, descripcion</w:t>
-            </w:r>
-          </w:p>
-        </w:tc>
-      </w:tr>
-      <w:tr>
-        <w:tblPrEx>
-          <w:tblCellMar>
-            <w:top w:w="0" w:type="dxa"/>
-            <w:bottom w:w="0" w:type="dxa"/>
-          </w:tblCellMar>
-        </w:tblPrEx>
-        <w:tc>
-          <w:tcPr>
-            <w:tcW w:w="3500" w:type="dxa"/>
-            <w:tcBorders>
-              <w:top w:val="single" w:sz="1" w:space="0" w:color="CCCCCC"/>
-              <w:left w:val="single" w:sz="1" w:space="0" w:color="CCCCCC"/>
-              <w:bottom w:val="single" w:sz="1" w:space="0" w:color="CCCCCC"/>
-              <w:right w:val="single" w:sz="1" w:space="0" w:color="CCCCCC"/>
-            </w:tcBorders>
-            <w:shd w:val="clear" w:color="auto" w:fill="F2F2F2"/>
-            <w:tcMar>
-              <w:top w:w="80" w:type="dxa"/>
-              <w:left w:w="120" w:type="dxa"/>
-              <w:bottom w:w="80" w:type="dxa"/>
-              <w:right w:w="120" w:type="dxa"/>
-            </w:tcMar>
-          </w:tcPr>
-          <w:p>
+              <w:t>LOGRO (</w:t>
+            </w:r>
+            <w:proofErr w:type="spellStart"/>
             <w:r>
               <w:rPr>
                 <w:b/>
@@ -5983,9 +5913,9 @@
                 <w:sz w:val="20"/>
                 <w:szCs w:val="20"/>
               </w:rPr>
-              <w:t xml:space="preserve">OBTENER (dni_usuario, </w:t>
-            </w:r>
-            <w:proofErr w:type="spellStart"/>
+              <w:t>codLogro</w:t>
+            </w:r>
+            <w:proofErr w:type="spellEnd"/>
             <w:r>
               <w:rPr>
                 <w:b/>
@@ -5994,9 +5924,58 @@
                 <w:sz w:val="20"/>
                 <w:szCs w:val="20"/>
               </w:rPr>
-              <w:t>cod_logro</w:t>
-            </w:r>
-            <w:proofErr w:type="spellEnd"/>
+              <w:t xml:space="preserve"> PK)</w:t>
+            </w:r>
+          </w:p>
+        </w:tc>
+        <w:tc>
+          <w:tcPr>
+            <w:tcW w:w="6138" w:type="dxa"/>
+            <w:tcBorders>
+              <w:top w:val="single" w:sz="1" w:space="0" w:color="CCCCCC"/>
+              <w:left w:val="single" w:sz="1" w:space="0" w:color="CCCCCC"/>
+              <w:bottom w:val="single" w:sz="1" w:space="0" w:color="CCCCCC"/>
+              <w:right w:val="single" w:sz="1" w:space="0" w:color="CCCCCC"/>
+            </w:tcBorders>
+            <w:shd w:val="clear" w:color="auto" w:fill="FFFFFF"/>
+            <w:tcMar>
+              <w:top w:w="80" w:type="dxa"/>
+              <w:left w:w="120" w:type="dxa"/>
+              <w:bottom w:w="80" w:type="dxa"/>
+              <w:right w:w="120" w:type="dxa"/>
+            </w:tcMar>
+          </w:tcPr>
+          <w:p>
+            <w:r>
+              <w:rPr>
+                <w:color w:val="000000"/>
+                <w:sz w:val="20"/>
+                <w:szCs w:val="20"/>
+              </w:rPr>
+              <w:t>nombre, descripcion</w:t>
+            </w:r>
+          </w:p>
+        </w:tc>
+      </w:tr>
+      <w:tr>
+        <w:tc>
+          <w:tcPr>
+            <w:tcW w:w="3500" w:type="dxa"/>
+            <w:tcBorders>
+              <w:top w:val="single" w:sz="1" w:space="0" w:color="CCCCCC"/>
+              <w:left w:val="single" w:sz="1" w:space="0" w:color="CCCCCC"/>
+              <w:bottom w:val="single" w:sz="1" w:space="0" w:color="CCCCCC"/>
+              <w:right w:val="single" w:sz="1" w:space="0" w:color="CCCCCC"/>
+            </w:tcBorders>
+            <w:shd w:val="clear" w:color="auto" w:fill="F2F2F2"/>
+            <w:tcMar>
+              <w:top w:w="80" w:type="dxa"/>
+              <w:left w:w="120" w:type="dxa"/>
+              <w:bottom w:w="80" w:type="dxa"/>
+              <w:right w:w="120" w:type="dxa"/>
+            </w:tcMar>
+          </w:tcPr>
+          <w:p>
             <w:r>
               <w:rPr>
                 <w:b/>
@@ -6005,64 +5984,9 @@
                 <w:sz w:val="20"/>
                 <w:szCs w:val="20"/>
               </w:rPr>
-              <w:t>) PK compuesta</w:t>
-            </w:r>
-          </w:p>
-        </w:tc>
-        <w:tc>
-          <w:tcPr>
-            <w:tcW w:w="6138" w:type="dxa"/>
-            <w:tcBorders>
-              <w:top w:val="single" w:sz="1" w:space="0" w:color="CCCCCC"/>
-              <w:left w:val="single" w:sz="1" w:space="0" w:color="CCCCCC"/>
-              <w:bottom w:val="single" w:sz="1" w:space="0" w:color="CCCCCC"/>
-              <w:right w:val="single" w:sz="1" w:space="0" w:color="CCCCCC"/>
-            </w:tcBorders>
-            <w:shd w:val="clear" w:color="auto" w:fill="F2F2F2"/>
-            <w:tcMar>
-              <w:top w:w="80" w:type="dxa"/>
-              <w:left w:w="120" w:type="dxa"/>
-              <w:bottom w:w="80" w:type="dxa"/>
-              <w:right w:w="120" w:type="dxa"/>
-            </w:tcMar>
-          </w:tcPr>
-          <w:p>
-            <w:r>
-              <w:rPr>
-                <w:color w:val="000000"/>
-                <w:sz w:val="20"/>
-                <w:szCs w:val="20"/>
-              </w:rPr>
-              <w:t>Relación M:M Usuario–Logro</w:t>
-            </w:r>
-          </w:p>
-        </w:tc>
-      </w:tr>
-      <w:tr>
-        <w:tblPrEx>
-          <w:tblCellMar>
-            <w:top w:w="0" w:type="dxa"/>
-            <w:bottom w:w="0" w:type="dxa"/>
-          </w:tblCellMar>
-        </w:tblPrEx>
-        <w:tc>
-          <w:tcPr>
-            <w:tcW w:w="3500" w:type="dxa"/>
-            <w:tcBorders>
-              <w:top w:val="single" w:sz="1" w:space="0" w:color="CCCCCC"/>
-              <w:left w:val="single" w:sz="1" w:space="0" w:color="CCCCCC"/>
-              <w:bottom w:val="single" w:sz="1" w:space="0" w:color="CCCCCC"/>
-              <w:right w:val="single" w:sz="1" w:space="0" w:color="CCCCCC"/>
-            </w:tcBorders>
-            <w:shd w:val="clear" w:color="auto" w:fill="FFFFFF"/>
-            <w:tcMar>
-              <w:top w:w="80" w:type="dxa"/>
-              <w:left w:w="120" w:type="dxa"/>
-              <w:bottom w:w="80" w:type="dxa"/>
-              <w:right w:w="120" w:type="dxa"/>
-            </w:tcMar>
-          </w:tcPr>
-          <w:p>
+              <w:t>OBTENER (</w:t>
+            </w:r>
+            <w:proofErr w:type="spellStart"/>
             <w:r>
               <w:rPr>
                 <w:b/>
@@ -6071,9 +5995,9 @@
                 <w:sz w:val="20"/>
                 <w:szCs w:val="20"/>
               </w:rPr>
-              <w:t>PROGRESO (</w:t>
-            </w:r>
-            <w:proofErr w:type="spellStart"/>
+              <w:t>dni_usuario</w:t>
+            </w:r>
+            <w:proofErr w:type="spellEnd"/>
             <w:r>
               <w:rPr>
                 <w:b/>
@@ -6082,9 +6006,9 @@
                 <w:sz w:val="20"/>
                 <w:szCs w:val="20"/>
               </w:rPr>
-              <w:t>codProgreso</w:t>
-            </w:r>
-            <w:proofErr w:type="spellEnd"/>
+              <w:t xml:space="preserve">, </w:t>
+            </w:r>
+            <w:proofErr w:type="spellStart"/>
             <w:r>
               <w:rPr>
                 <w:b/>
@@ -6093,6 +6017,99 @@
                 <w:sz w:val="20"/>
                 <w:szCs w:val="20"/>
               </w:rPr>
+              <w:t>cod_logro</w:t>
+            </w:r>
+            <w:proofErr w:type="spellEnd"/>
+            <w:r>
+              <w:rPr>
+                <w:b/>
+                <w:bCs/>
+                <w:color w:val="1F4E79"/>
+                <w:sz w:val="20"/>
+                <w:szCs w:val="20"/>
+              </w:rPr>
+              <w:t>) PK compuesta</w:t>
+            </w:r>
+          </w:p>
+        </w:tc>
+        <w:tc>
+          <w:tcPr>
+            <w:tcW w:w="6138" w:type="dxa"/>
+            <w:tcBorders>
+              <w:top w:val="single" w:sz="1" w:space="0" w:color="CCCCCC"/>
+              <w:left w:val="single" w:sz="1" w:space="0" w:color="CCCCCC"/>
+              <w:bottom w:val="single" w:sz="1" w:space="0" w:color="CCCCCC"/>
+              <w:right w:val="single" w:sz="1" w:space="0" w:color="CCCCCC"/>
+            </w:tcBorders>
+            <w:shd w:val="clear" w:color="auto" w:fill="F2F2F2"/>
+            <w:tcMar>
+              <w:top w:w="80" w:type="dxa"/>
+              <w:left w:w="120" w:type="dxa"/>
+              <w:bottom w:w="80" w:type="dxa"/>
+              <w:right w:w="120" w:type="dxa"/>
+            </w:tcMar>
+          </w:tcPr>
+          <w:p>
+            <w:r>
+              <w:rPr>
+                <w:color w:val="000000"/>
+                <w:sz w:val="20"/>
+                <w:szCs w:val="20"/>
+              </w:rPr>
+              <w:t>Relación M:M Usuario–Logro</w:t>
+            </w:r>
+          </w:p>
+        </w:tc>
+      </w:tr>
+      <w:tr>
+        <w:tc>
+          <w:tcPr>
+            <w:tcW w:w="3500" w:type="dxa"/>
+            <w:tcBorders>
+              <w:top w:val="single" w:sz="1" w:space="0" w:color="CCCCCC"/>
+              <w:left w:val="single" w:sz="1" w:space="0" w:color="CCCCCC"/>
+              <w:bottom w:val="single" w:sz="1" w:space="0" w:color="CCCCCC"/>
+              <w:right w:val="single" w:sz="1" w:space="0" w:color="CCCCCC"/>
+            </w:tcBorders>
+            <w:shd w:val="clear" w:color="auto" w:fill="FFFFFF"/>
+            <w:tcMar>
+              <w:top w:w="80" w:type="dxa"/>
+              <w:left w:w="120" w:type="dxa"/>
+              <w:bottom w:w="80" w:type="dxa"/>
+              <w:right w:w="120" w:type="dxa"/>
+            </w:tcMar>
+          </w:tcPr>
+          <w:p>
+            <w:r>
+              <w:rPr>
+                <w:b/>
+                <w:bCs/>
+                <w:color w:val="1F4E79"/>
+                <w:sz w:val="20"/>
+                <w:szCs w:val="20"/>
+              </w:rPr>
+              <w:t>PROGRESO (</w:t>
+            </w:r>
+            <w:proofErr w:type="spellStart"/>
+            <w:r>
+              <w:rPr>
+                <w:b/>
+                <w:bCs/>
+                <w:color w:val="1F4E79"/>
+                <w:sz w:val="20"/>
+                <w:szCs w:val="20"/>
+              </w:rPr>
+              <w:t>codProgreso</w:t>
+            </w:r>
+            <w:proofErr w:type="spellEnd"/>
+            <w:r>
+              <w:rPr>
+                <w:b/>
+                <w:bCs/>
+                <w:color w:val="1F4E79"/>
+                <w:sz w:val="20"/>
+                <w:szCs w:val="20"/>
+              </w:rPr>
               <w:t xml:space="preserve"> PK)</w:t>
             </w:r>
           </w:p>
@@ -6131,7 +6148,25 @@
                 <w:sz w:val="20"/>
                 <w:szCs w:val="20"/>
               </w:rPr>
-              <w:t>, nivel, dni_usuario FK</w:t>
+              <w:t xml:space="preserve">, nivel, </w:t>
+            </w:r>
+            <w:proofErr w:type="spellStart"/>
+            <w:r>
+              <w:rPr>
+                <w:color w:val="000000"/>
+                <w:sz w:val="20"/>
+                <w:szCs w:val="20"/>
+              </w:rPr>
+              <w:t>dni_usuario</w:t>
+            </w:r>
+            <w:proofErr w:type="spellEnd"/>
+            <w:r>
+              <w:rPr>
+                <w:color w:val="000000"/>
+                <w:sz w:val="20"/>
+                <w:szCs w:val="20"/>
+              </w:rPr>
+              <w:t xml:space="preserve"> FK</w:t>
             </w:r>
           </w:p>
         </w:tc>
@@ -6178,6 +6213,9 @@
         <w:spacing w:before="40"/>
       </w:pPr>
       <w:r>
+        <w:rPr>
+          <w:noProof/>
+        </w:rPr>
         <w:drawing>
           <wp:inline distT="0" distB="0" distL="0" distR="0" wp14:anchorId="3BF77B8A" wp14:editId="204B2990">
             <wp:extent cx="5974080" cy="3561638"/>
@@ -6220,6 +6258,9 @@
         <w:spacing w:before="80"/>
       </w:pPr>
       <w:r>
+        <w:rPr>
+          <w:noProof/>
+        </w:rPr>
         <w:lastRenderedPageBreak/>
         <w:drawing>
           <wp:anchor distT="0" distB="0" distL="114300" distR="114300" simplePos="0" relativeHeight="251661312" behindDoc="1" locked="0" layoutInCell="1" allowOverlap="1" wp14:anchorId="1474E598" wp14:editId="76A64BF6">
@@ -6278,6 +6319,9 @@
         </w:drawing>
       </w:r>
       <w:r>
+        <w:rPr>
+          <w:noProof/>
+        </w:rPr>
         <w:drawing>
           <wp:anchor distT="0" distB="0" distL="114300" distR="114300" simplePos="0" relativeHeight="251659264" behindDoc="1" locked="0" layoutInCell="1" allowOverlap="1" wp14:anchorId="55812A67" wp14:editId="29ECD177">
             <wp:simplePos x="0" y="0"/>
@@ -6335,6 +6379,9 @@
         </w:drawing>
       </w:r>
       <w:r>
+        <w:rPr>
+          <w:noProof/>
+        </w:rPr>
         <w:drawing>
           <wp:inline distT="0" distB="0" distL="0" distR="0" wp14:anchorId="2CA4B2F4" wp14:editId="1F2A9D55">
             <wp:extent cx="2029108" cy="4163006"/>
@@ -6415,12 +6462,6 @@
         <w:gridCol w:w="7138"/>
       </w:tblGrid>
       <w:tr>
-        <w:tblPrEx>
-          <w:tblCellMar>
-            <w:top w:w="0" w:type="dxa"/>
-            <w:bottom w:w="0" w:type="dxa"/>
-          </w:tblCellMar>
-        </w:tblPrEx>
         <w:tc>
           <w:tcPr>
             <w:tcW w:w="2500" w:type="dxa"/>
@@ -6481,12 +6522,6 @@
         </w:tc>
       </w:tr>
       <w:tr>
-        <w:tblPrEx>
-          <w:tblCellMar>
-            <w:top w:w="0" w:type="dxa"/>
-            <w:bottom w:w="0" w:type="dxa"/>
-          </w:tblCellMar>
-        </w:tblPrEx>
         <w:tc>
           <w:tcPr>
             <w:tcW w:w="2500" w:type="dxa"/>
@@ -6547,12 +6582,6 @@
         </w:tc>
       </w:tr>
       <w:tr>
-        <w:tblPrEx>
-          <w:tblCellMar>
-            <w:top w:w="0" w:type="dxa"/>
-            <w:bottom w:w="0" w:type="dxa"/>
-          </w:tblCellMar>
-        </w:tblPrEx>
         <w:tc>
           <w:tcPr>
             <w:tcW w:w="2500" w:type="dxa"/>
@@ -6856,6 +6885,9 @@
         <w:spacing w:before="40"/>
       </w:pPr>
       <w:r>
+        <w:rPr>
+          <w:noProof/>
+        </w:rPr>
         <w:drawing>
           <wp:inline distT="0" distB="0" distL="0" distR="0" wp14:anchorId="2D39650C" wp14:editId="5F05519B">
             <wp:extent cx="6120130" cy="720725"/>
@@ -6898,6 +6930,9 @@
         <w:spacing w:before="40"/>
       </w:pPr>
       <w:r>
+        <w:rPr>
+          <w:noProof/>
+        </w:rPr>
         <w:drawing>
           <wp:inline distT="0" distB="0" distL="0" distR="0" wp14:anchorId="4BFDD206" wp14:editId="46A39FB1">
             <wp:extent cx="6120130" cy="2308860"/>
@@ -6940,6 +6975,9 @@
         <w:spacing w:before="40"/>
       </w:pPr>
       <w:r>
+        <w:rPr>
+          <w:noProof/>
+        </w:rPr>
         <w:drawing>
           <wp:inline distT="0" distB="0" distL="0" distR="0" wp14:anchorId="1511A5D2" wp14:editId="338F44A3">
             <wp:extent cx="6120130" cy="2820670"/>
@@ -6991,6 +7029,9 @@
         <w:spacing w:before="80"/>
       </w:pPr>
       <w:r>
+        <w:rPr>
+          <w:noProof/>
+        </w:rPr>
         <w:lastRenderedPageBreak/>
         <w:drawing>
           <wp:inline distT="0" distB="0" distL="0" distR="0" wp14:anchorId="42380A9B" wp14:editId="1A078E0B">
@@ -7034,6 +7075,9 @@
         <w:spacing w:before="80"/>
       </w:pPr>
       <w:r>
+        <w:rPr>
+          <w:noProof/>
+        </w:rPr>
         <w:drawing>
           <wp:inline distT="0" distB="0" distL="0" distR="0" wp14:anchorId="093AADA2" wp14:editId="29562DA1">
             <wp:extent cx="6120130" cy="1760220"/>
@@ -7106,27 +7150,33 @@
     </w:p>
     <w:p>
       <w:pPr>
-        <w:pStyle w:val="Prrafodelista"/>
-        <w:numPr>
-          <w:ilvl w:val="0"/>
-          <w:numId w:val="3"/>
-        </w:numPr>
         <w:spacing w:before="40"/>
-      </w:pPr>
-      <w:r>
-        <w:t>Siendo la página 1280px de ancho la barra de navegación pasa a estar debajo del encabezado de forma horizontal:</w:t>
-      </w:r>
-    </w:p>
-    <w:p>
-      <w:pPr>
-        <w:spacing w:before="40"/>
-      </w:pPr>
-      <w:r>
+        <w:rPr>
+          <w:b/>
+          <w:bCs/>
+          <w:color w:val="2F5597"/>
+          <w:sz w:val="24"/>
+          <w:szCs w:val="24"/>
+        </w:rPr>
+      </w:pPr>
+      <w:bookmarkStart w:id="21" w:name="_Toc226902163"/>
+      <w:r>
+        <w:rPr>
+          <w:noProof/>
+        </w:rPr>
         <w:drawing>
-          <wp:inline distT="0" distB="0" distL="0" distR="0" wp14:anchorId="1131873C" wp14:editId="4CDAC032">
-            <wp:extent cx="6120130" cy="1784985"/>
-            <wp:effectExtent l="0" t="0" r="0" b="5715"/>
-            <wp:docPr id="157306238" name="Imagen 1"/>
+          <wp:anchor distT="0" distB="0" distL="114300" distR="114300" simplePos="0" relativeHeight="251663360" behindDoc="0" locked="0" layoutInCell="1" allowOverlap="1" wp14:anchorId="2E8FED12" wp14:editId="69A1D6CB">
+            <wp:simplePos x="0" y="0"/>
+            <wp:positionH relativeFrom="column">
+              <wp:posOffset>4411728</wp:posOffset>
+            </wp:positionH>
+            <wp:positionV relativeFrom="paragraph">
+              <wp:posOffset>69215</wp:posOffset>
+            </wp:positionV>
+            <wp:extent cx="1533525" cy="1811020"/>
+            <wp:effectExtent l="0" t="0" r="9525" b="0"/>
+            <wp:wrapSquare wrapText="bothSides"/>
+            <wp:docPr id="218112827" name="Imagen 1"/>
             <wp:cNvGraphicFramePr>
               <a:graphicFrameLocks xmlns:a="http://schemas.openxmlformats.org/drawingml/2006/main" noChangeAspect="1"/>
             </wp:cNvGraphicFramePr>
@@ -7134,61 +7184,336 @@
               <a:graphicData uri="http://schemas.openxmlformats.org/drawingml/2006/picture">
                 <pic:pic xmlns:pic="http://schemas.openxmlformats.org/drawingml/2006/picture">
                   <pic:nvPicPr>
-                    <pic:cNvPr id="157306238" name=""/>
-                    <pic:cNvPicPr/>
+                    <pic:cNvPr id="0" name="Picture 1"/>
+                    <pic:cNvPicPr>
+                      <a:picLocks noChangeAspect="1" noChangeArrowheads="1"/>
+                    </pic:cNvPicPr>
                   </pic:nvPicPr>
                   <pic:blipFill>
-                    <a:blip r:embed="rId17"/>
+                    <a:blip r:embed="rId17" cstate="print">
+                      <a:extLst>
+                        <a:ext uri="{28A0092B-C50C-407E-A947-70E740481C1C}">
+                          <a14:useLocalDpi xmlns:a14="http://schemas.microsoft.com/office/drawing/2010/main" val="0"/>
+                        </a:ext>
+                      </a:extLst>
+                    </a:blip>
+                    <a:srcRect/>
                     <a:stretch>
                       <a:fillRect/>
                     </a:stretch>
                   </pic:blipFill>
-                  <pic:spPr>
+                  <pic:spPr bwMode="auto">
                     <a:xfrm>
                       <a:off x="0" y="0"/>
-                      <a:ext cx="6120130" cy="1784985"/>
+                      <a:ext cx="1533525" cy="1811020"/>
                     </a:xfrm>
                     <a:prstGeom prst="rect">
                       <a:avLst/>
                     </a:prstGeom>
+                    <a:noFill/>
+                    <a:ln>
+                      <a:noFill/>
+                    </a:ln>
                   </pic:spPr>
                 </pic:pic>
               </a:graphicData>
             </a:graphic>
-          </wp:inline>
+            <wp14:sizeRelH relativeFrom="page">
+              <wp14:pctWidth>0</wp14:pctWidth>
+            </wp14:sizeRelH>
+            <wp14:sizeRelV relativeFrom="page">
+              <wp14:pctHeight>0</wp14:pctHeight>
+            </wp14:sizeRelV>
+          </wp:anchor>
         </w:drawing>
       </w:r>
-    </w:p>
-    <w:p>
-      <w:pPr>
-        <w:spacing w:before="60"/>
-      </w:pPr>
     </w:p>
     <w:p>
       <w:pPr>
         <w:pStyle w:val="Prrafodelista"/>
         <w:numPr>
           <w:ilvl w:val="0"/>
-          <w:numId w:val="3"/>
+          <w:numId w:val="5"/>
         </w:numPr>
-        <w:spacing w:before="60"/>
-      </w:pPr>
-      <w:r>
-        <w:t>A partir de 840px de ancho todas las secciones del contenedor principal pasan a estar apiladas de forma vertical, y la barra de navegación se queda igual.</w:t>
-      </w:r>
+        <w:spacing w:before="40"/>
+      </w:pPr>
+      <w:r>
+        <w:t xml:space="preserve">Al principio tuvimos una idea clara, en base a lo que queríamos que tuviese la página web, que eran: un bloque de </w:t>
+      </w:r>
+      <w:r>
+        <w:rPr>
+          <w:b/>
+          <w:bCs/>
+        </w:rPr>
+        <w:t>entrenamientos</w:t>
+      </w:r>
+      <w:r>
+        <w:t xml:space="preserve"> en el que se explicase en consisten los entrenamientos disponibles en la aplicación, también un bloque de </w:t>
+      </w:r>
+      <w:r>
+        <w:rPr>
+          <w:b/>
+          <w:bCs/>
+        </w:rPr>
+        <w:t>clubs</w:t>
+      </w:r>
+      <w:r>
+        <w:t xml:space="preserve"> en el que se quiere llamar la atención de los usuarios a que accedan a estos mediante la aplicación, y finalmente, una </w:t>
+      </w:r>
+      <w:r>
+        <w:rPr>
+          <w:b/>
+          <w:bCs/>
+        </w:rPr>
+        <w:t>calculadora del índice de masa corporal</w:t>
+      </w:r>
+      <w:r>
+        <w:t>, que tiene un funcionamiento básico para el usuario que solo quiera conocer su estado en base a eta fórmula.</w:t>
+      </w:r>
+    </w:p>
+    <w:p>
+      <w:pPr>
+        <w:spacing w:before="40"/>
+        <w:rPr>
+          <w:sz w:val="4"/>
+          <w:szCs w:val="4"/>
+        </w:rPr>
+      </w:pPr>
+    </w:p>
+    <w:p>
+      <w:pPr>
+        <w:pStyle w:val="Prrafodelista"/>
+        <w:spacing w:before="40"/>
+        <w:ind w:left="720"/>
+      </w:pPr>
     </w:p>
     <w:p>
       <w:pPr>
         <w:pStyle w:val="Prrafodelista"/>
         <w:numPr>
           <w:ilvl w:val="0"/>
-          <w:numId w:val="3"/>
+          <w:numId w:val="5"/>
         </w:numPr>
-        <w:spacing w:before="60"/>
-      </w:pPr>
-      <w:r>
-        <w:t>Siendo la página de 480px o menos la distribución sigue de la misma forma que en 840px, pero ahora los tamaños de las fuentes/iconos se disminuyen para que no se rompa el estilo de la página.</w:t>
-      </w:r>
+        <w:spacing w:before="40"/>
+      </w:pPr>
+      <w:r>
+        <w:rPr>
+          <w:noProof/>
+        </w:rPr>
+        <w:drawing>
+          <wp:anchor distT="0" distB="0" distL="114300" distR="114300" simplePos="0" relativeHeight="251664384" behindDoc="0" locked="0" layoutInCell="1" allowOverlap="1" wp14:anchorId="59A81C0C" wp14:editId="2BCCC4AC">
+            <wp:simplePos x="0" y="0"/>
+            <wp:positionH relativeFrom="margin">
+              <wp:posOffset>4429760</wp:posOffset>
+            </wp:positionH>
+            <wp:positionV relativeFrom="paragraph">
+              <wp:posOffset>53975</wp:posOffset>
+            </wp:positionV>
+            <wp:extent cx="1515745" cy="1809115"/>
+            <wp:effectExtent l="0" t="0" r="8255" b="635"/>
+            <wp:wrapSquare wrapText="bothSides"/>
+            <wp:docPr id="1396135075" name="Imagen 2"/>
+            <wp:cNvGraphicFramePr>
+              <a:graphicFrameLocks xmlns:a="http://schemas.openxmlformats.org/drawingml/2006/main" noChangeAspect="1"/>
+            </wp:cNvGraphicFramePr>
+            <a:graphic xmlns:a="http://schemas.openxmlformats.org/drawingml/2006/main">
+              <a:graphicData uri="http://schemas.openxmlformats.org/drawingml/2006/picture">
+                <pic:pic xmlns:pic="http://schemas.openxmlformats.org/drawingml/2006/picture">
+                  <pic:nvPicPr>
+                    <pic:cNvPr id="0" name="Picture 2"/>
+                    <pic:cNvPicPr>
+                      <a:picLocks noChangeAspect="1" noChangeArrowheads="1"/>
+                    </pic:cNvPicPr>
+                  </pic:nvPicPr>
+                  <pic:blipFill>
+                    <a:blip r:embed="rId18" cstate="print">
+                      <a:extLst>
+                        <a:ext uri="{28A0092B-C50C-407E-A947-70E740481C1C}">
+                          <a14:useLocalDpi xmlns:a14="http://schemas.microsoft.com/office/drawing/2010/main" val="0"/>
+                        </a:ext>
+                      </a:extLst>
+                    </a:blip>
+                    <a:srcRect/>
+                    <a:stretch>
+                      <a:fillRect/>
+                    </a:stretch>
+                  </pic:blipFill>
+                  <pic:spPr bwMode="auto">
+                    <a:xfrm>
+                      <a:off x="0" y="0"/>
+                      <a:ext cx="1515745" cy="1809115"/>
+                    </a:xfrm>
+                    <a:prstGeom prst="rect">
+                      <a:avLst/>
+                    </a:prstGeom>
+                    <a:noFill/>
+                    <a:ln>
+                      <a:noFill/>
+                    </a:ln>
+                  </pic:spPr>
+                </pic:pic>
+              </a:graphicData>
+            </a:graphic>
+            <wp14:sizeRelH relativeFrom="page">
+              <wp14:pctWidth>0</wp14:pctWidth>
+            </wp14:sizeRelH>
+            <wp14:sizeRelV relativeFrom="page">
+              <wp14:pctHeight>0</wp14:pctHeight>
+            </wp14:sizeRelV>
+          </wp:anchor>
+        </w:drawing>
+      </w:r>
+      <w:r>
+        <w:t>Más tarde</w:t>
+      </w:r>
+      <w:r>
+        <w:t xml:space="preserve"> quisimos añadir un </w:t>
+      </w:r>
+      <w:r>
+        <w:rPr>
+          <w:b/>
+          <w:bCs/>
+        </w:rPr>
+        <w:t>formulario</w:t>
+      </w:r>
+      <w:r>
+        <w:t xml:space="preserve"> y también cambiamos un poco la </w:t>
+      </w:r>
+      <w:r>
+        <w:rPr>
+          <w:b/>
+          <w:bCs/>
+        </w:rPr>
+        <w:t>distribución</w:t>
+      </w:r>
+      <w:r>
+        <w:t xml:space="preserve"> de los bloques principales</w:t>
+      </w:r>
+      <w:r>
+        <w:t>, ya que, de esta forma nos parecía más claro visualmente para el usuario que visite la página web.</w:t>
+      </w:r>
+    </w:p>
+    <w:p>
+      <w:r>
+        <w:br w:type="page"/>
+      </w:r>
+    </w:p>
+    <w:p>
+      <w:pPr>
+        <w:pStyle w:val="Prrafodelista"/>
+        <w:spacing w:before="40"/>
+        <w:ind w:left="720"/>
+      </w:pPr>
+    </w:p>
+    <w:p>
+      <w:pPr>
+        <w:pStyle w:val="Prrafodelista"/>
+        <w:numPr>
+          <w:ilvl w:val="0"/>
+          <w:numId w:val="5"/>
+        </w:numPr>
+        <w:spacing w:before="40"/>
+      </w:pPr>
+      <w:r>
+        <w:rPr>
+          <w:b/>
+          <w:bCs/>
+          <w:noProof/>
+          <w:color w:val="2F5597"/>
+          <w:sz w:val="24"/>
+          <w:szCs w:val="24"/>
+        </w:rPr>
+        <w:drawing>
+          <wp:anchor distT="0" distB="0" distL="114300" distR="114300" simplePos="0" relativeHeight="251665408" behindDoc="0" locked="0" layoutInCell="1" allowOverlap="1" wp14:anchorId="3DA71D4C" wp14:editId="57B1BD1B">
+            <wp:simplePos x="0" y="0"/>
+            <wp:positionH relativeFrom="margin">
+              <wp:align>right</wp:align>
+            </wp:positionH>
+            <wp:positionV relativeFrom="paragraph">
+              <wp:posOffset>0</wp:posOffset>
+            </wp:positionV>
+            <wp:extent cx="1716405" cy="2122805"/>
+            <wp:effectExtent l="0" t="0" r="0" b="0"/>
+            <wp:wrapSquare wrapText="bothSides"/>
+            <wp:docPr id="53484527" name="Imagen 3"/>
+            <wp:cNvGraphicFramePr>
+              <a:graphicFrameLocks xmlns:a="http://schemas.openxmlformats.org/drawingml/2006/main" noChangeAspect="1"/>
+            </wp:cNvGraphicFramePr>
+            <a:graphic xmlns:a="http://schemas.openxmlformats.org/drawingml/2006/main">
+              <a:graphicData uri="http://schemas.openxmlformats.org/drawingml/2006/picture">
+                <pic:pic xmlns:pic="http://schemas.openxmlformats.org/drawingml/2006/picture">
+                  <pic:nvPicPr>
+                    <pic:cNvPr id="0" name="Picture 3"/>
+                    <pic:cNvPicPr>
+                      <a:picLocks noChangeAspect="1" noChangeArrowheads="1"/>
+                    </pic:cNvPicPr>
+                  </pic:nvPicPr>
+                  <pic:blipFill>
+                    <a:blip r:embed="rId19" cstate="print">
+                      <a:extLst>
+                        <a:ext uri="{28A0092B-C50C-407E-A947-70E740481C1C}">
+                          <a14:useLocalDpi xmlns:a14="http://schemas.microsoft.com/office/drawing/2010/main" val="0"/>
+                        </a:ext>
+                      </a:extLst>
+                    </a:blip>
+                    <a:srcRect/>
+                    <a:stretch>
+                      <a:fillRect/>
+                    </a:stretch>
+                  </pic:blipFill>
+                  <pic:spPr bwMode="auto">
+                    <a:xfrm>
+                      <a:off x="0" y="0"/>
+                      <a:ext cx="1716405" cy="2122805"/>
+                    </a:xfrm>
+                    <a:prstGeom prst="rect">
+                      <a:avLst/>
+                    </a:prstGeom>
+                    <a:noFill/>
+                    <a:ln>
+                      <a:noFill/>
+                    </a:ln>
+                  </pic:spPr>
+                </pic:pic>
+              </a:graphicData>
+            </a:graphic>
+            <wp14:sizeRelH relativeFrom="page">
+              <wp14:pctWidth>0</wp14:pctWidth>
+            </wp14:sizeRelH>
+            <wp14:sizeRelV relativeFrom="page">
+              <wp14:pctHeight>0</wp14:pctHeight>
+            </wp14:sizeRelV>
+          </wp:anchor>
+        </w:drawing>
+      </w:r>
+      <w:r>
+        <w:t xml:space="preserve">Finalmente tuvimos que hacer el </w:t>
+      </w:r>
+      <w:r>
+        <w:rPr>
+          <w:b/>
+          <w:bCs/>
+        </w:rPr>
+        <w:t>acceso a la base de datos</w:t>
+      </w:r>
+      <w:r>
+        <w:t xml:space="preserve">, para esto pensamos en hacer una tabla debajo del formulario en el que aparezcan todas las </w:t>
+      </w:r>
+      <w:r>
+        <w:rPr>
+          <w:b/>
+          <w:bCs/>
+        </w:rPr>
+        <w:t>consultas</w:t>
+      </w:r>
+      <w:r>
+        <w:t xml:space="preserve"> que se hayan hecho a través del formulario de contacto</w:t>
+      </w:r>
+    </w:p>
+    <w:p>
+      <w:pPr>
+        <w:spacing w:before="40"/>
+      </w:pPr>
     </w:p>
     <w:p>
       <w:pPr>
@@ -7200,17 +7525,32 @@
           <w:szCs w:val="24"/>
         </w:rPr>
       </w:pPr>
-      <w:bookmarkStart w:id="21" w:name="_Toc226902163"/>
-      <w:r>
-        <w:br w:type="page"/>
-      </w:r>
     </w:p>
     <w:p>
       <w:pPr>
         <w:pStyle w:val="Ttulo3"/>
       </w:pPr>
-      <w:r>
-        <w:lastRenderedPageBreak/>
+    </w:p>
+    <w:p>
+      <w:pPr>
+        <w:pStyle w:val="Ttulo3"/>
+      </w:pPr>
+    </w:p>
+    <w:p>
+      <w:pPr>
+        <w:pStyle w:val="Ttulo3"/>
+      </w:pPr>
+    </w:p>
+    <w:p>
+      <w:pPr>
+        <w:pStyle w:val="Ttulo3"/>
+      </w:pPr>
+    </w:p>
+    <w:p>
+      <w:pPr>
+        <w:pStyle w:val="Ttulo3"/>
+      </w:pPr>
+      <w:r>
         <w:t>2.4.3 Justificación del Diseño</w:t>
       </w:r>
       <w:bookmarkEnd w:id="21"/>
@@ -7248,12 +7588,6 @@
         <w:gridCol w:w="6638"/>
       </w:tblGrid>
       <w:tr>
-        <w:tblPrEx>
-          <w:tblCellMar>
-            <w:top w:w="0" w:type="dxa"/>
-            <w:bottom w:w="0" w:type="dxa"/>
-          </w:tblCellMar>
-        </w:tblPrEx>
         <w:tc>
           <w:tcPr>
             <w:tcW w:w="3000" w:type="dxa"/>
@@ -7314,12 +7648,6 @@
         </w:tc>
       </w:tr>
       <w:tr>
-        <w:tblPrEx>
-          <w:tblCellMar>
-            <w:top w:w="0" w:type="dxa"/>
-            <w:bottom w:w="0" w:type="dxa"/>
-          </w:tblCellMar>
-        </w:tblPrEx>
         <w:tc>
           <w:tcPr>
             <w:tcW w:w="3000" w:type="dxa"/>
@@ -7380,12 +7708,6 @@
         </w:tc>
       </w:tr>
       <w:tr>
-        <w:tblPrEx>
-          <w:tblCellMar>
-            <w:top w:w="0" w:type="dxa"/>
-            <w:bottom w:w="0" w:type="dxa"/>
-          </w:tblCellMar>
-        </w:tblPrEx>
         <w:tc>
           <w:tcPr>
             <w:tcW w:w="3000" w:type="dxa"/>
@@ -7446,12 +7768,6 @@
         </w:tc>
       </w:tr>
       <w:tr>
-        <w:tblPrEx>
-          <w:tblCellMar>
-            <w:top w:w="0" w:type="dxa"/>
-            <w:bottom w:w="0" w:type="dxa"/>
-          </w:tblCellMar>
-        </w:tblPrEx>
         <w:tc>
           <w:tcPr>
             <w:tcW w:w="3000" w:type="dxa"/>
@@ -7512,12 +7828,6 @@
         </w:tc>
       </w:tr>
       <w:tr>
-        <w:tblPrEx>
-          <w:tblCellMar>
-            <w:top w:w="0" w:type="dxa"/>
-            <w:bottom w:w="0" w:type="dxa"/>
-          </w:tblCellMar>
-        </w:tblPrEx>
         <w:tc>
           <w:tcPr>
             <w:tcW w:w="3000" w:type="dxa"/>
@@ -7578,12 +7888,6 @@
         </w:tc>
       </w:tr>
       <w:tr>
-        <w:tblPrEx>
-          <w:tblCellMar>
-            <w:top w:w="0" w:type="dxa"/>
-            <w:bottom w:w="0" w:type="dxa"/>
-          </w:tblCellMar>
-        </w:tblPrEx>
         <w:tc>
           <w:tcPr>
             <w:tcW w:w="3000" w:type="dxa"/>
@@ -7726,12 +8030,6 @@
         <w:gridCol w:w="6638"/>
       </w:tblGrid>
       <w:tr>
-        <w:tblPrEx>
-          <w:tblCellMar>
-            <w:top w:w="0" w:type="dxa"/>
-            <w:bottom w:w="0" w:type="dxa"/>
-          </w:tblCellMar>
-        </w:tblPrEx>
         <w:tc>
           <w:tcPr>
             <w:tcW w:w="3000" w:type="dxa"/>
@@ -7810,12 +8108,6 @@
         </w:tc>
       </w:tr>
       <w:tr>
-        <w:tblPrEx>
-          <w:tblCellMar>
-            <w:top w:w="0" w:type="dxa"/>
-            <w:bottom w:w="0" w:type="dxa"/>
-          </w:tblCellMar>
-        </w:tblPrEx>
         <w:tc>
           <w:tcPr>
             <w:tcW w:w="3000" w:type="dxa"/>
@@ -7894,12 +8186,6 @@
         </w:tc>
       </w:tr>
       <w:tr>
-        <w:tblPrEx>
-          <w:tblCellMar>
-            <w:top w:w="0" w:type="dxa"/>
-            <w:bottom w:w="0" w:type="dxa"/>
-          </w:tblCellMar>
-        </w:tblPrEx>
         <w:tc>
           <w:tcPr>
             <w:tcW w:w="3000" w:type="dxa"/>
@@ -7960,12 +8246,6 @@
         </w:tc>
       </w:tr>
       <w:tr>
-        <w:tblPrEx>
-          <w:tblCellMar>
-            <w:top w:w="0" w:type="dxa"/>
-            <w:bottom w:w="0" w:type="dxa"/>
-          </w:tblCellMar>
-        </w:tblPrEx>
         <w:tc>
           <w:tcPr>
             <w:tcW w:w="3000" w:type="dxa"/>
@@ -8044,12 +8324,6 @@
         </w:tc>
       </w:tr>
       <w:tr>
-        <w:tblPrEx>
-          <w:tblCellMar>
-            <w:top w:w="0" w:type="dxa"/>
-            <w:bottom w:w="0" w:type="dxa"/>
-          </w:tblCellMar>
-        </w:tblPrEx>
         <w:tc>
           <w:tcPr>
             <w:tcW w:w="3000" w:type="dxa"/>
@@ -8128,12 +8402,6 @@
         </w:tc>
       </w:tr>
       <w:tr>
-        <w:tblPrEx>
-          <w:tblCellMar>
-            <w:top w:w="0" w:type="dxa"/>
-            <w:bottom w:w="0" w:type="dxa"/>
-          </w:tblCellMar>
-        </w:tblPrEx>
         <w:tc>
           <w:tcPr>
             <w:tcW w:w="3000" w:type="dxa"/>
@@ -8212,12 +8480,6 @@
         </w:tc>
       </w:tr>
       <w:tr>
-        <w:tblPrEx>
-          <w:tblCellMar>
-            <w:top w:w="0" w:type="dxa"/>
-            <w:bottom w:w="0" w:type="dxa"/>
-          </w:tblCellMar>
-        </w:tblPrEx>
         <w:tc>
           <w:tcPr>
             <w:tcW w:w="3000" w:type="dxa"/>
@@ -8332,12 +8594,6 @@
         </w:tc>
       </w:tr>
       <w:tr>
-        <w:tblPrEx>
-          <w:tblCellMar>
-            <w:top w:w="0" w:type="dxa"/>
-            <w:bottom w:w="0" w:type="dxa"/>
-          </w:tblCellMar>
-        </w:tblPrEx>
         <w:tc>
           <w:tcPr>
             <w:tcW w:w="3000" w:type="dxa"/>
@@ -8398,12 +8654,6 @@
         </w:tc>
       </w:tr>
       <w:tr>
-        <w:tblPrEx>
-          <w:tblCellMar>
-            <w:top w:w="0" w:type="dxa"/>
-            <w:bottom w:w="0" w:type="dxa"/>
-          </w:tblCellMar>
-        </w:tblPrEx>
         <w:tc>
           <w:tcPr>
             <w:tcW w:w="3000" w:type="dxa"/>
@@ -8464,12 +8714,6 @@
         </w:tc>
       </w:tr>
       <w:tr>
-        <w:tblPrEx>
-          <w:tblCellMar>
-            <w:top w:w="0" w:type="dxa"/>
-            <w:bottom w:w="0" w:type="dxa"/>
-          </w:tblCellMar>
-        </w:tblPrEx>
         <w:tc>
           <w:tcPr>
             <w:tcW w:w="3000" w:type="dxa"/>
@@ -8542,18 +8786,30 @@
                 <w:sz w:val="20"/>
                 <w:szCs w:val="20"/>
               </w:rPr>
-              <w:t>, dni_usuario).</w:t>
+              <w:t xml:space="preserve">, </w:t>
+            </w:r>
+            <w:proofErr w:type="spellStart"/>
+            <w:r>
+              <w:rPr>
+                <w:color w:val="000000"/>
+                <w:sz w:val="20"/>
+                <w:szCs w:val="20"/>
+              </w:rPr>
+              <w:t>dni_usuario</w:t>
+            </w:r>
+            <w:proofErr w:type="spellEnd"/>
+            <w:r>
+              <w:rPr>
+                <w:color w:val="000000"/>
+                <w:sz w:val="20"/>
+                <w:szCs w:val="20"/>
+              </w:rPr>
+              <w:t>).</w:t>
             </w:r>
           </w:p>
         </w:tc>
       </w:tr>
       <w:tr>
-        <w:tblPrEx>
-          <w:tblCellMar>
-            <w:top w:w="0" w:type="dxa"/>
-            <w:bottom w:w="0" w:type="dxa"/>
-          </w:tblCellMar>
-        </w:tblPrEx>
         <w:tc>
           <w:tcPr>
             <w:tcW w:w="3000" w:type="dxa"/>
@@ -8614,12 +8870,6 @@
         </w:tc>
       </w:tr>
       <w:tr>
-        <w:tblPrEx>
-          <w:tblCellMar>
-            <w:top w:w="0" w:type="dxa"/>
-            <w:bottom w:w="0" w:type="dxa"/>
-          </w:tblCellMar>
-        </w:tblPrEx>
         <w:tc>
           <w:tcPr>
             <w:tcW w:w="3000" w:type="dxa"/>
@@ -8716,12 +8966,6 @@
         </w:tc>
       </w:tr>
       <w:tr>
-        <w:tblPrEx>
-          <w:tblCellMar>
-            <w:top w:w="0" w:type="dxa"/>
-            <w:bottom w:w="0" w:type="dxa"/>
-          </w:tblCellMar>
-        </w:tblPrEx>
         <w:tc>
           <w:tcPr>
             <w:tcW w:w="3000" w:type="dxa"/>
@@ -8800,12 +9044,6 @@
         </w:tc>
       </w:tr>
       <w:tr>
-        <w:tblPrEx>
-          <w:tblCellMar>
-            <w:top w:w="0" w:type="dxa"/>
-            <w:bottom w:w="0" w:type="dxa"/>
-          </w:tblCellMar>
-        </w:tblPrEx>
         <w:tc>
           <w:tcPr>
             <w:tcW w:w="3000" w:type="dxa"/>
@@ -8884,12 +9122,6 @@
         </w:tc>
       </w:tr>
       <w:tr>
-        <w:tblPrEx>
-          <w:tblCellMar>
-            <w:top w:w="0" w:type="dxa"/>
-            <w:bottom w:w="0" w:type="dxa"/>
-          </w:tblCellMar>
-        </w:tblPrEx>
         <w:tc>
           <w:tcPr>
             <w:tcW w:w="3000" w:type="dxa"/>
@@ -8944,7 +9176,25 @@
                 <w:sz w:val="20"/>
                 <w:szCs w:val="20"/>
               </w:rPr>
-              <w:t xml:space="preserve">10 registros. PK compuesta (dni_usuario, </w:t>
+              <w:t>10 registros. PK compuesta (</w:t>
+            </w:r>
+            <w:proofErr w:type="spellStart"/>
+            <w:r>
+              <w:rPr>
+                <w:color w:val="000000"/>
+                <w:sz w:val="20"/>
+                <w:szCs w:val="20"/>
+              </w:rPr>
+              <w:t>dni_usuario</w:t>
+            </w:r>
+            <w:proofErr w:type="spellEnd"/>
+            <w:r>
+              <w:rPr>
+                <w:color w:val="000000"/>
+                <w:sz w:val="20"/>
+                <w:szCs w:val="20"/>
+              </w:rPr>
+              <w:t xml:space="preserve">, </w:t>
             </w:r>
             <w:proofErr w:type="spellStart"/>
             <w:r>
@@ -8968,12 +9218,6 @@
         </w:tc>
       </w:tr>
       <w:tr>
-        <w:tblPrEx>
-          <w:tblCellMar>
-            <w:top w:w="0" w:type="dxa"/>
-            <w:bottom w:w="0" w:type="dxa"/>
-          </w:tblCellMar>
-        </w:tblPrEx>
         <w:tc>
           <w:tcPr>
             <w:tcW w:w="3000" w:type="dxa"/>
@@ -9224,12 +9468,6 @@
         <w:gridCol w:w="6638"/>
       </w:tblGrid>
       <w:tr>
-        <w:tblPrEx>
-          <w:tblCellMar>
-            <w:top w:w="0" w:type="dxa"/>
-            <w:bottom w:w="0" w:type="dxa"/>
-          </w:tblCellMar>
-        </w:tblPrEx>
         <w:tc>
           <w:tcPr>
             <w:tcW w:w="3000" w:type="dxa"/>
@@ -9290,12 +9528,6 @@
         </w:tc>
       </w:tr>
       <w:tr>
-        <w:tblPrEx>
-          <w:tblCellMar>
-            <w:top w:w="0" w:type="dxa"/>
-            <w:bottom w:w="0" w:type="dxa"/>
-          </w:tblCellMar>
-        </w:tblPrEx>
         <w:tc>
           <w:tcPr>
             <w:tcW w:w="3000" w:type="dxa"/>
@@ -9356,12 +9588,6 @@
         </w:tc>
       </w:tr>
       <w:tr>
-        <w:tblPrEx>
-          <w:tblCellMar>
-            <w:top w:w="0" w:type="dxa"/>
-            <w:bottom w:w="0" w:type="dxa"/>
-          </w:tblCellMar>
-        </w:tblPrEx>
         <w:tc>
           <w:tcPr>
             <w:tcW w:w="3000" w:type="dxa"/>
@@ -9422,12 +9648,6 @@
         </w:tc>
       </w:tr>
       <w:tr>
-        <w:tblPrEx>
-          <w:tblCellMar>
-            <w:top w:w="0" w:type="dxa"/>
-            <w:bottom w:w="0" w:type="dxa"/>
-          </w:tblCellMar>
-        </w:tblPrEx>
         <w:tc>
           <w:tcPr>
             <w:tcW w:w="3000" w:type="dxa"/>
@@ -9504,26 +9724,12 @@
                 <w:sz w:val="20"/>
                 <w:szCs w:val="20"/>
               </w:rPr>
-              <w:t>relación</w:t>
-            </w:r>
-            <w:r>
-              <w:rPr>
-                <w:color w:val="000000"/>
-                <w:sz w:val="20"/>
-                <w:szCs w:val="20"/>
-              </w:rPr>
-              <w:t xml:space="preserve"> entre 2 y 3 tablas: usuarios-clubs, eventos-anuncios, usuarios-entrenamientos.</w:t>
+              <w:t>relación entre 2 y 3 tablas: usuarios-clubs, eventos-anuncios, usuarios-entrenamientos.</w:t>
             </w:r>
           </w:p>
         </w:tc>
       </w:tr>
       <w:tr>
-        <w:tblPrEx>
-          <w:tblCellMar>
-            <w:top w:w="0" w:type="dxa"/>
-            <w:bottom w:w="0" w:type="dxa"/>
-          </w:tblCellMar>
-        </w:tblPrEx>
         <w:tc>
           <w:tcPr>
             <w:tcW w:w="3000" w:type="dxa"/>
@@ -9584,12 +9790,6 @@
         </w:tc>
       </w:tr>
       <w:tr>
-        <w:tblPrEx>
-          <w:tblCellMar>
-            <w:top w:w="0" w:type="dxa"/>
-            <w:bottom w:w="0" w:type="dxa"/>
-          </w:tblCellMar>
-        </w:tblPrEx>
         <w:tc>
           <w:tcPr>
             <w:tcW w:w="3000" w:type="dxa"/>
@@ -9650,12 +9850,6 @@
         </w:tc>
       </w:tr>
       <w:tr>
-        <w:tblPrEx>
-          <w:tblCellMar>
-            <w:top w:w="0" w:type="dxa"/>
-            <w:bottom w:w="0" w:type="dxa"/>
-          </w:tblCellMar>
-        </w:tblPrEx>
         <w:tc>
           <w:tcPr>
             <w:tcW w:w="3000" w:type="dxa"/>
@@ -9716,12 +9910,6 @@
         </w:tc>
       </w:tr>
       <w:tr>
-        <w:tblPrEx>
-          <w:tblCellMar>
-            <w:top w:w="0" w:type="dxa"/>
-            <w:bottom w:w="0" w:type="dxa"/>
-          </w:tblCellMar>
-        </w:tblPrEx>
         <w:tc>
           <w:tcPr>
             <w:tcW w:w="3000" w:type="dxa"/>
@@ -9782,12 +9970,6 @@
         </w:tc>
       </w:tr>
       <w:tr>
-        <w:tblPrEx>
-          <w:tblCellMar>
-            <w:top w:w="0" w:type="dxa"/>
-            <w:bottom w:w="0" w:type="dxa"/>
-          </w:tblCellMar>
-        </w:tblPrEx>
         <w:tc>
           <w:tcPr>
             <w:tcW w:w="3000" w:type="dxa"/>
@@ -10010,7 +10192,19 @@
         <w:rPr>
           <w:color w:val="000000"/>
         </w:rPr>
-        <w:t>Gestión completa CRUD de todas las entidades del sistema.</w:t>
+        <w:t>Gestión completa CRUD</w:t>
+      </w:r>
+      <w:r>
+        <w:rPr>
+          <w:color w:val="000000"/>
+        </w:rPr>
+        <w:t xml:space="preserve"> sobre ciertas entidades</w:t>
+      </w:r>
+      <w:r>
+        <w:rPr>
+          <w:color w:val="000000"/>
+        </w:rPr>
+        <w:t>.</w:t>
       </w:r>
     </w:p>
     <w:p>
@@ -10026,7 +10220,7 @@
         <w:rPr>
           <w:color w:val="000000"/>
         </w:rPr>
-        <w:t>Interfaz gráfica de usuario (GUI) con formularios para cada entidad.</w:t>
+        <w:t>Interfaz gráfica de usuario (GUI).</w:t>
       </w:r>
     </w:p>
     <w:p>
@@ -10111,22 +10305,6 @@
     </w:p>
     <w:p>
       <w:pPr>
-        <w:pStyle w:val="Prrafodelista"/>
-        <w:numPr>
-          <w:ilvl w:val="0"/>
-          <w:numId w:val="2"/>
-        </w:numPr>
-        <w:spacing w:before="40" w:after="40"/>
-      </w:pPr>
-      <w:r>
-        <w:rPr>
-          <w:color w:val="000000"/>
-        </w:rPr>
-        <w:t>Control de amistad entre usuarios (reflexiva).</w:t>
-      </w:r>
-    </w:p>
-    <w:p>
-      <w:pPr>
         <w:pStyle w:val="Ttulo3"/>
       </w:pPr>
       <w:bookmarkStart w:id="30" w:name="_Toc226902172"/>
@@ -10141,11 +10319,20 @@
       </w:pPr>
       <w:r>
         <w:rPr>
+          <w:rFonts w:ascii="Segoe UI Symbol" w:hAnsi="Segoe UI Symbol" w:cs="Segoe UI Symbol"/>
           <w:b/>
           <w:bCs/>
           <w:color w:val="CC0000"/>
         </w:rPr>
-        <w:t>⚠ POR HACER: Describir la clase de conexión (DAO o similar): driver JDBC utilizado, cadena de conexión, gestión de excepciones y cierre de recursos.</w:t>
+        <w:t>⚠</w:t>
+      </w:r>
+      <w:r>
+        <w:rPr>
+          <w:b/>
+          <w:bCs/>
+          <w:color w:val="CC0000"/>
+        </w:rPr>
+        <w:t xml:space="preserve"> POR HACER: Describir la clase de conexión (DAO o similar): driver JDBC utilizado, cadena de conexión, gestión de excepciones y cierre de recursos.</w:t>
       </w:r>
     </w:p>
     <w:p>
@@ -10218,12 +10405,6 @@
         <w:gridCol w:w="6638"/>
       </w:tblGrid>
       <w:tr>
-        <w:tblPrEx>
-          <w:tblCellMar>
-            <w:top w:w="0" w:type="dxa"/>
-            <w:bottom w:w="0" w:type="dxa"/>
-          </w:tblCellMar>
-        </w:tblPrEx>
         <w:tc>
           <w:tcPr>
             <w:tcW w:w="3000" w:type="dxa"/>
@@ -10284,12 +10465,6 @@
         </w:tc>
       </w:tr>
       <w:tr>
-        <w:tblPrEx>
-          <w:tblCellMar>
-            <w:top w:w="0" w:type="dxa"/>
-            <w:bottom w:w="0" w:type="dxa"/>
-          </w:tblCellMar>
-        </w:tblPrEx>
         <w:tc>
           <w:tcPr>
             <w:tcW w:w="3000" w:type="dxa"/>
@@ -10350,12 +10525,6 @@
         </w:tc>
       </w:tr>
       <w:tr>
-        <w:tblPrEx>
-          <w:tblCellMar>
-            <w:top w:w="0" w:type="dxa"/>
-            <w:bottom w:w="0" w:type="dxa"/>
-          </w:tblCellMar>
-        </w:tblPrEx>
         <w:tc>
           <w:tcPr>
             <w:tcW w:w="3000" w:type="dxa"/>
@@ -10416,12 +10585,6 @@
         </w:tc>
       </w:tr>
       <w:tr>
-        <w:tblPrEx>
-          <w:tblCellMar>
-            <w:top w:w="0" w:type="dxa"/>
-            <w:bottom w:w="0" w:type="dxa"/>
-          </w:tblCellMar>
-        </w:tblPrEx>
         <w:tc>
           <w:tcPr>
             <w:tcW w:w="3000" w:type="dxa"/>
@@ -10505,18 +10668,30 @@
                 <w:sz w:val="20"/>
                 <w:szCs w:val="20"/>
               </w:rPr>
-              <w:t xml:space="preserve"> y CSS Grid del contenedor.</w:t>
+              <w:t xml:space="preserve"> y CSS </w:t>
+            </w:r>
+            <w:proofErr w:type="spellStart"/>
+            <w:r>
+              <w:rPr>
+                <w:color w:val="000000"/>
+                <w:sz w:val="20"/>
+                <w:szCs w:val="20"/>
+              </w:rPr>
+              <w:t>Grid</w:t>
+            </w:r>
+            <w:proofErr w:type="spellEnd"/>
+            <w:r>
+              <w:rPr>
+                <w:color w:val="000000"/>
+                <w:sz w:val="20"/>
+                <w:szCs w:val="20"/>
+              </w:rPr>
+              <w:t xml:space="preserve"> del contenedor.</w:t>
             </w:r>
           </w:p>
         </w:tc>
       </w:tr>
       <w:tr>
-        <w:tblPrEx>
-          <w:tblCellMar>
-            <w:top w:w="0" w:type="dxa"/>
-            <w:bottom w:w="0" w:type="dxa"/>
-          </w:tblCellMar>
-        </w:tblPrEx>
         <w:tc>
           <w:tcPr>
             <w:tcW w:w="3000" w:type="dxa"/>
@@ -10577,12 +10752,6 @@
         </w:tc>
       </w:tr>
       <w:tr>
-        <w:tblPrEx>
-          <w:tblCellMar>
-            <w:top w:w="0" w:type="dxa"/>
-            <w:bottom w:w="0" w:type="dxa"/>
-          </w:tblCellMar>
-        </w:tblPrEx>
         <w:tc>
           <w:tcPr>
             <w:tcW w:w="3000" w:type="dxa"/>
@@ -10643,12 +10812,6 @@
         </w:tc>
       </w:tr>
       <w:tr>
-        <w:tblPrEx>
-          <w:tblCellMar>
-            <w:top w:w="0" w:type="dxa"/>
-            <w:bottom w:w="0" w:type="dxa"/>
-          </w:tblCellMar>
-        </w:tblPrEx>
         <w:tc>
           <w:tcPr>
             <w:tcW w:w="3000" w:type="dxa"/>
@@ -10709,12 +10872,6 @@
         </w:tc>
       </w:tr>
       <w:tr>
-        <w:tblPrEx>
-          <w:tblCellMar>
-            <w:top w:w="0" w:type="dxa"/>
-            <w:bottom w:w="0" w:type="dxa"/>
-          </w:tblCellMar>
-        </w:tblPrEx>
         <w:tc>
           <w:tcPr>
             <w:tcW w:w="3000" w:type="dxa"/>
@@ -10775,12 +10932,6 @@
         </w:tc>
       </w:tr>
       <w:tr>
-        <w:tblPrEx>
-          <w:tblCellMar>
-            <w:top w:w="0" w:type="dxa"/>
-            <w:bottom w:w="0" w:type="dxa"/>
-          </w:tblCellMar>
-        </w:tblPrEx>
         <w:tc>
           <w:tcPr>
             <w:tcW w:w="3000" w:type="dxa"/>
@@ -10841,12 +10992,6 @@
         </w:tc>
       </w:tr>
       <w:tr>
-        <w:tblPrEx>
-          <w:tblCellMar>
-            <w:top w:w="0" w:type="dxa"/>
-            <w:bottom w:w="0" w:type="dxa"/>
-          </w:tblCellMar>
-        </w:tblPrEx>
         <w:tc>
           <w:tcPr>
             <w:tcW w:w="3000" w:type="dxa"/>
@@ -10907,12 +11052,6 @@
         </w:tc>
       </w:tr>
       <w:tr>
-        <w:tblPrEx>
-          <w:tblCellMar>
-            <w:top w:w="0" w:type="dxa"/>
-            <w:bottom w:w="0" w:type="dxa"/>
-          </w:tblCellMar>
-        </w:tblPrEx>
         <w:tc>
           <w:tcPr>
             <w:tcW w:w="3000" w:type="dxa"/>
@@ -10973,12 +11112,6 @@
         </w:tc>
       </w:tr>
       <w:tr>
-        <w:tblPrEx>
-          <w:tblCellMar>
-            <w:top w:w="0" w:type="dxa"/>
-            <w:bottom w:w="0" w:type="dxa"/>
-          </w:tblCellMar>
-        </w:tblPrEx>
         <w:tc>
           <w:tcPr>
             <w:tcW w:w="3000" w:type="dxa"/>
@@ -11039,12 +11172,6 @@
         </w:tc>
       </w:tr>
       <w:tr>
-        <w:tblPrEx>
-          <w:tblCellMar>
-            <w:top w:w="0" w:type="dxa"/>
-            <w:bottom w:w="0" w:type="dxa"/>
-          </w:tblCellMar>
-        </w:tblPrEx>
         <w:tc>
           <w:tcPr>
             <w:tcW w:w="3000" w:type="dxa"/>
@@ -11123,55 +11250,151 @@
     <w:p>
       <w:pPr>
         <w:spacing w:after="60"/>
-      </w:pPr>
-      <w:r>
         <w:rPr>
           <w:color w:val="000000"/>
         </w:rPr>
-        <w:t>La página web realiza una lectura de la base de datos para mostrar información actualizada. En concreto:</w:t>
-      </w:r>
-    </w:p>
-    <w:p>
-      <w:pPr>
-        <w:spacing w:before="60" w:after="60"/>
-      </w:pPr>
+      </w:pPr>
+      <w:r>
+        <w:rPr>
+          <w:color w:val="000000"/>
+        </w:rPr>
+        <w:t>La página web realiza una lectura de la base de datos para mostrar información actualizada. En concreto</w:t>
+      </w:r>
+      <w:r>
+        <w:rPr>
+          <w:color w:val="000000"/>
+        </w:rPr>
+        <w:t xml:space="preserve">, lo que se hace, es hacer una consulta a la </w:t>
+      </w:r>
       <w:r>
         <w:rPr>
           <w:b/>
           <w:bCs/>
-          <w:color w:val="CC0000"/>
-        </w:rPr>
-        <w:t xml:space="preserve">⚠ POR HACER: Describir qué dato se lee de la base de datos (por ejemplo, número de usuarios registrados, número de clubs activos o catálogo de entrenamientos) y cómo se realiza la conexión (tecnología </w:t>
-      </w:r>
-      <w:proofErr w:type="spellStart"/>
+          <w:color w:val="000000"/>
+        </w:rPr>
+        <w:t>BBDD</w:t>
+      </w:r>
+      <w:r>
+        <w:rPr>
+          <w:color w:val="000000"/>
+        </w:rPr>
+        <w:t xml:space="preserve"> mediante un fichero </w:t>
+      </w:r>
       <w:r>
         <w:rPr>
           <w:b/>
           <w:bCs/>
-          <w:color w:val="CC0000"/>
-        </w:rPr>
-        <w:t>backend</w:t>
-      </w:r>
-      <w:proofErr w:type="spellEnd"/>
+          <w:color w:val="000000"/>
+        </w:rPr>
+        <w:t>PHP</w:t>
+      </w:r>
+      <w:r>
+        <w:rPr>
+          <w:color w:val="000000"/>
+        </w:rPr>
+        <w:t xml:space="preserve">, en el que se obtiene, el nombre, el asunto y la fecha de realización del formulario de contacto, esta tabla se mantiene </w:t>
+      </w:r>
       <w:r>
         <w:rPr>
           <w:b/>
           <w:bCs/>
-          <w:color w:val="CC0000"/>
-        </w:rPr>
-        <w:t xml:space="preserve"> utilizada: PHP, Node.js, API REST, etc.).</w:t>
-      </w:r>
-    </w:p>
-    <w:p>
-      <w:pPr>
-        <w:spacing w:before="60"/>
-      </w:pPr>
+          <w:color w:val="000000"/>
+        </w:rPr>
+        <w:t>actualizada</w:t>
+      </w:r>
+      <w:r>
+        <w:rPr>
+          <w:color w:val="000000"/>
+        </w:rPr>
+        <w:t xml:space="preserve">, cada vez que se envía un formulario se añade una </w:t>
+      </w:r>
+      <w:r>
+        <w:rPr>
+          <w:b/>
+          <w:bCs/>
+          <w:color w:val="000000"/>
+        </w:rPr>
+        <w:t>nueva fila</w:t>
+      </w:r>
+      <w:r>
+        <w:rPr>
+          <w:color w:val="000000"/>
+        </w:rPr>
+        <w:t xml:space="preserve"> a la BBDD, por tanto, también a la tabla de la página web, también hemos agregado un botón para poder </w:t>
+      </w:r>
+      <w:r>
+        <w:rPr>
+          <w:b/>
+          <w:bCs/>
+          <w:color w:val="000000"/>
+        </w:rPr>
+        <w:t>eliminar</w:t>
+      </w:r>
+      <w:r>
+        <w:rPr>
+          <w:color w:val="000000"/>
+        </w:rPr>
+        <w:t xml:space="preserve"> las filas que queramos.</w:t>
+      </w:r>
+    </w:p>
+    <w:p>
+      <w:pPr>
+        <w:spacing w:after="60"/>
+      </w:pPr>
+      <w:r>
+        <w:drawing>
+          <wp:inline distT="0" distB="0" distL="0" distR="0" wp14:anchorId="5F74962F" wp14:editId="5279CCC9">
+            <wp:extent cx="6120130" cy="2051050"/>
+            <wp:effectExtent l="0" t="0" r="0" b="6350"/>
+            <wp:docPr id="2078769527" name="Imagen 1"/>
+            <wp:cNvGraphicFramePr>
+              <a:graphicFrameLocks xmlns:a="http://schemas.openxmlformats.org/drawingml/2006/main" noChangeAspect="1"/>
+            </wp:cNvGraphicFramePr>
+            <a:graphic xmlns:a="http://schemas.openxmlformats.org/drawingml/2006/main">
+              <a:graphicData uri="http://schemas.openxmlformats.org/drawingml/2006/picture">
+                <pic:pic xmlns:pic="http://schemas.openxmlformats.org/drawingml/2006/picture">
+                  <pic:nvPicPr>
+                    <pic:cNvPr id="2078769527" name=""/>
+                    <pic:cNvPicPr/>
+                  </pic:nvPicPr>
+                  <pic:blipFill>
+                    <a:blip r:embed="rId20"/>
+                    <a:stretch>
+                      <a:fillRect/>
+                    </a:stretch>
+                  </pic:blipFill>
+                  <pic:spPr>
+                    <a:xfrm>
+                      <a:off x="0" y="0"/>
+                      <a:ext cx="6120130" cy="2051050"/>
+                    </a:xfrm>
+                    <a:prstGeom prst="rect">
+                      <a:avLst/>
+                    </a:prstGeom>
+                  </pic:spPr>
+                </pic:pic>
+              </a:graphicData>
+            </a:graphic>
+          </wp:inline>
+        </w:drawing>
+      </w:r>
+    </w:p>
+    <w:p>
+      <w:pPr>
+        <w:rPr>
+          <w:b/>
+          <w:bCs/>
+          <w:color w:val="2F5597"/>
+          <w:sz w:val="24"/>
+          <w:szCs w:val="24"/>
+        </w:rPr>
+      </w:pPr>
+      <w:bookmarkStart w:id="35" w:name="_Toc226902177"/>
     </w:p>
     <w:p>
       <w:pPr>
         <w:pStyle w:val="Ttulo3"/>
       </w:pPr>
-      <w:bookmarkStart w:id="35" w:name="_Toc226902177"/>
       <w:r>
         <w:t>3.3.3 Funcionalidades Implementadas</w:t>
       </w:r>
@@ -11301,6 +11524,7 @@
         <w:rPr>
           <w:noProof/>
         </w:rPr>
+        <w:lastRenderedPageBreak/>
         <w:drawing>
           <wp:anchor distT="0" distB="0" distL="114300" distR="114300" simplePos="0" relativeHeight="251662336" behindDoc="0" locked="0" layoutInCell="1" allowOverlap="1" wp14:anchorId="5C89F775" wp14:editId="18F381C0">
             <wp:simplePos x="0" y="0"/>
@@ -11327,7 +11551,7 @@
                     </pic:cNvPicPr>
                   </pic:nvPicPr>
                   <pic:blipFill>
-                    <a:blip r:embed="rId18">
+                    <a:blip r:embed="rId21">
                       <a:extLst>
                         <a:ext uri="{28A0092B-C50C-407E-A947-70E740481C1C}">
                           <a14:useLocalDpi xmlns:a14="http://schemas.microsoft.com/office/drawing/2010/main" val="0"/>
@@ -11559,12 +11783,6 @@
         <w:gridCol w:w="9638"/>
       </w:tblGrid>
       <w:tr>
-        <w:tblPrEx>
-          <w:tblCellMar>
-            <w:top w:w="0" w:type="dxa"/>
-            <w:bottom w:w="0" w:type="dxa"/>
-          </w:tblCellMar>
-        </w:tblPrEx>
         <w:tc>
           <w:tcPr>
             <w:tcW w:w="9638" w:type="dxa"/>
@@ -11640,12 +11858,6 @@
         <w:gridCol w:w="9638"/>
       </w:tblGrid>
       <w:tr>
-        <w:tblPrEx>
-          <w:tblCellMar>
-            <w:top w:w="0" w:type="dxa"/>
-            <w:bottom w:w="0" w:type="dxa"/>
-          </w:tblCellMar>
-        </w:tblPrEx>
         <w:tc>
           <w:tcPr>
             <w:tcW w:w="9638" w:type="dxa"/>
@@ -11721,12 +11933,6 @@
         <w:gridCol w:w="9638"/>
       </w:tblGrid>
       <w:tr>
-        <w:tblPrEx>
-          <w:tblCellMar>
-            <w:top w:w="0" w:type="dxa"/>
-            <w:bottom w:w="0" w:type="dxa"/>
-          </w:tblCellMar>
-        </w:tblPrEx>
         <w:tc>
           <w:tcPr>
             <w:tcW w:w="9638" w:type="dxa"/>
@@ -11802,12 +12008,6 @@
         <w:gridCol w:w="9638"/>
       </w:tblGrid>
       <w:tr>
-        <w:tblPrEx>
-          <w:tblCellMar>
-            <w:top w:w="0" w:type="dxa"/>
-            <w:bottom w:w="0" w:type="dxa"/>
-          </w:tblCellMar>
-        </w:tblPrEx>
         <w:tc>
           <w:tcPr>
             <w:tcW w:w="9638" w:type="dxa"/>
@@ -11904,39 +12104,17 @@
       <w:pPr>
         <w:pStyle w:val="Ttulo3"/>
       </w:pPr>
-      <w:bookmarkStart w:id="41" w:name="_Toc226902183"/>
-      <w:r>
-        <w:t>4.2.1 Conexión con la Base de Datos</w:t>
+      <w:bookmarkStart w:id="41" w:name="_Toc226902184"/>
+      <w:r>
+        <w:t>4.2.</w:t>
+      </w:r>
+      <w:r>
+        <w:t>1</w:t>
+      </w:r>
+      <w:r>
+        <w:t xml:space="preserve"> Validaciones del Formulario de Contacto</w:t>
       </w:r>
       <w:bookmarkEnd w:id="41"/>
-    </w:p>
-    <w:p>
-      <w:pPr>
-        <w:spacing w:before="60" w:after="60"/>
-      </w:pPr>
-      <w:r>
-        <w:rPr>
-          <w:b/>
-          <w:bCs/>
-          <w:color w:val="CC0000"/>
-        </w:rPr>
-        <w:t>⚠ POR HACER: Añadir captura y descripción de la prueba de lectura de datos desde la base de datos en la página web: qué dato se muestra, cómo se verifica que viene de la BD y no es un valor estático.</w:t>
-      </w:r>
-    </w:p>
-    <w:p>
-      <w:pPr>
-        <w:spacing w:before="80"/>
-      </w:pPr>
-    </w:p>
-    <w:p>
-      <w:pPr>
-        <w:pStyle w:val="Ttulo3"/>
-      </w:pPr>
-      <w:bookmarkStart w:id="42" w:name="_Toc226902184"/>
-      <w:r>
-        <w:t>4.2.2 Validaciones del Formulario de Contacto</w:t>
-      </w:r>
-      <w:bookmarkEnd w:id="42"/>
     </w:p>
     <w:p>
       <w:pPr>
@@ -11971,12 +12149,6 @@
         <w:gridCol w:w="6638"/>
       </w:tblGrid>
       <w:tr>
-        <w:tblPrEx>
-          <w:tblCellMar>
-            <w:top w:w="0" w:type="dxa"/>
-            <w:bottom w:w="0" w:type="dxa"/>
-          </w:tblCellMar>
-        </w:tblPrEx>
         <w:tc>
           <w:tcPr>
             <w:tcW w:w="3000" w:type="dxa"/>
@@ -12037,12 +12209,6 @@
         </w:tc>
       </w:tr>
       <w:tr>
-        <w:tblPrEx>
-          <w:tblCellMar>
-            <w:top w:w="0" w:type="dxa"/>
-            <w:bottom w:w="0" w:type="dxa"/>
-          </w:tblCellMar>
-        </w:tblPrEx>
         <w:tc>
           <w:tcPr>
             <w:tcW w:w="3000" w:type="dxa"/>
@@ -12069,7 +12235,6 @@
                 <w:sz w:val="20"/>
                 <w:szCs w:val="20"/>
               </w:rPr>
-              <w:lastRenderedPageBreak/>
               <w:t>Campo Email</w:t>
             </w:r>
           </w:p>
@@ -12104,12 +12269,6 @@
         </w:tc>
       </w:tr>
       <w:tr>
-        <w:tblPrEx>
-          <w:tblCellMar>
-            <w:top w:w="0" w:type="dxa"/>
-            <w:bottom w:w="0" w:type="dxa"/>
-          </w:tblCellMar>
-        </w:tblPrEx>
         <w:tc>
           <w:tcPr>
             <w:tcW w:w="3000" w:type="dxa"/>
@@ -12180,12 +12339,6 @@
         </w:tc>
       </w:tr>
       <w:tr>
-        <w:tblPrEx>
-          <w:tblCellMar>
-            <w:top w:w="0" w:type="dxa"/>
-            <w:bottom w:w="0" w:type="dxa"/>
-          </w:tblCellMar>
-        </w:tblPrEx>
         <w:tc>
           <w:tcPr>
             <w:tcW w:w="3000" w:type="dxa"/>
@@ -12256,12 +12409,6 @@
         </w:tc>
       </w:tr>
       <w:tr>
-        <w:tblPrEx>
-          <w:tblCellMar>
-            <w:top w:w="0" w:type="dxa"/>
-            <w:bottom w:w="0" w:type="dxa"/>
-          </w:tblCellMar>
-        </w:tblPrEx>
         <w:tc>
           <w:tcPr>
             <w:tcW w:w="3000" w:type="dxa"/>
@@ -12288,6 +12435,7 @@
                 <w:sz w:val="20"/>
                 <w:szCs w:val="20"/>
               </w:rPr>
+              <w:lastRenderedPageBreak/>
               <w:t>Botón Enviar</w:t>
             </w:r>
           </w:p>
@@ -12340,12 +12488,6 @@
         </w:tc>
       </w:tr>
       <w:tr>
-        <w:tblPrEx>
-          <w:tblCellMar>
-            <w:top w:w="0" w:type="dxa"/>
-            <w:bottom w:w="0" w:type="dxa"/>
-          </w:tblCellMar>
-        </w:tblPrEx>
         <w:tc>
           <w:tcPr>
             <w:tcW w:w="3000" w:type="dxa"/>
@@ -12429,167 +12571,586 @@
         <w:spacing w:before="40"/>
       </w:pPr>
     </w:p>
-    <w:tbl>
-      <w:tblPr>
-        <w:tblW w:w="9638" w:type="dxa"/>
-        <w:tblBorders>
-          <w:top w:val="single" w:sz="4" w:space="0" w:color="auto"/>
-          <w:left w:val="single" w:sz="4" w:space="0" w:color="auto"/>
-          <w:bottom w:val="single" w:sz="4" w:space="0" w:color="auto"/>
-          <w:right w:val="single" w:sz="4" w:space="0" w:color="auto"/>
-          <w:insideH w:val="single" w:sz="4" w:space="0" w:color="auto"/>
-          <w:insideV w:val="single" w:sz="4" w:space="0" w:color="auto"/>
-        </w:tblBorders>
-        <w:tblCellMar>
-          <w:left w:w="10" w:type="dxa"/>
-          <w:right w:w="10" w:type="dxa"/>
-        </w:tblCellMar>
-        <w:tblLook w:val="04A0" w:firstRow="1" w:lastRow="0" w:firstColumn="1" w:lastColumn="0" w:noHBand="0" w:noVBand="1"/>
-      </w:tblPr>
-      <w:tblGrid>
-        <w:gridCol w:w="9638"/>
-      </w:tblGrid>
-      <w:tr>
-        <w:tblPrEx>
-          <w:tblCellMar>
-            <w:top w:w="0" w:type="dxa"/>
-            <w:bottom w:w="0" w:type="dxa"/>
-          </w:tblCellMar>
-        </w:tblPrEx>
-        <w:tc>
-          <w:tcPr>
-            <w:tcW w:w="9638" w:type="dxa"/>
-            <w:tcBorders>
-              <w:top w:val="single" w:sz="1" w:space="0" w:color="CCCCCC"/>
-              <w:left w:val="single" w:sz="1" w:space="0" w:color="CCCCCC"/>
-              <w:bottom w:val="single" w:sz="1" w:space="0" w:color="CCCCCC"/>
-              <w:right w:val="single" w:sz="1" w:space="0" w:color="CCCCCC"/>
-            </w:tcBorders>
-            <w:shd w:val="clear" w:color="auto" w:fill="EBF3FB"/>
-            <w:tcMar>
-              <w:top w:w="200" w:type="dxa"/>
-              <w:left w:w="300" w:type="dxa"/>
-              <w:bottom w:w="200" w:type="dxa"/>
-              <w:right w:w="300" w:type="dxa"/>
-            </w:tcMar>
-          </w:tcPr>
-          <w:p>
-            <w:pPr>
-              <w:jc w:val="center"/>
-            </w:pPr>
-            <w:r>
-              <w:rPr>
-                <w:b/>
-                <w:bCs/>
-                <w:color w:val="2E75B6"/>
-                <w:sz w:val="24"/>
-                <w:szCs w:val="24"/>
-              </w:rPr>
-              <w:t>[ IMAGEN ]</w:t>
-            </w:r>
-          </w:p>
-          <w:p>
-            <w:pPr>
-              <w:spacing w:before="80"/>
-              <w:jc w:val="center"/>
-            </w:pPr>
-            <w:r>
-              <w:rPr>
-                <w:color w:val="555555"/>
-                <w:sz w:val="19"/>
-                <w:szCs w:val="19"/>
-              </w:rPr>
-              <w:t>Captura del formulario de contacto mostrando los mensajes de validación cuando se intenta enviar con campos vacíos o con formato incorrecto.</w:t>
-            </w:r>
-          </w:p>
-        </w:tc>
-      </w:tr>
-    </w:tbl>
     <w:p>
       <w:pPr>
         <w:spacing w:before="40"/>
       </w:pPr>
-    </w:p>
-    <w:tbl>
-      <w:tblPr>
-        <w:tblW w:w="9638" w:type="dxa"/>
-        <w:tblBorders>
-          <w:top w:val="single" w:sz="4" w:space="0" w:color="auto"/>
-          <w:left w:val="single" w:sz="4" w:space="0" w:color="auto"/>
-          <w:bottom w:val="single" w:sz="4" w:space="0" w:color="auto"/>
-          <w:right w:val="single" w:sz="4" w:space="0" w:color="auto"/>
-          <w:insideH w:val="single" w:sz="4" w:space="0" w:color="auto"/>
-          <w:insideV w:val="single" w:sz="4" w:space="0" w:color="auto"/>
-        </w:tblBorders>
-        <w:tblCellMar>
-          <w:left w:w="10" w:type="dxa"/>
-          <w:right w:w="10" w:type="dxa"/>
-        </w:tblCellMar>
-        <w:tblLook w:val="04A0" w:firstRow="1" w:lastRow="0" w:firstColumn="1" w:lastColumn="0" w:noHBand="0" w:noVBand="1"/>
-      </w:tblPr>
-      <w:tblGrid>
-        <w:gridCol w:w="9638"/>
-      </w:tblGrid>
-      <w:tr>
-        <w:tblPrEx>
-          <w:tblCellMar>
-            <w:top w:w="0" w:type="dxa"/>
-            <w:bottom w:w="0" w:type="dxa"/>
-          </w:tblCellMar>
-        </w:tblPrEx>
-        <w:tc>
-          <w:tcPr>
-            <w:tcW w:w="9638" w:type="dxa"/>
-            <w:tcBorders>
-              <w:top w:val="single" w:sz="1" w:space="0" w:color="CCCCCC"/>
-              <w:left w:val="single" w:sz="1" w:space="0" w:color="CCCCCC"/>
-              <w:bottom w:val="single" w:sz="1" w:space="0" w:color="CCCCCC"/>
-              <w:right w:val="single" w:sz="1" w:space="0" w:color="CCCCCC"/>
-            </w:tcBorders>
-            <w:shd w:val="clear" w:color="auto" w:fill="EBF3FB"/>
-            <w:tcMar>
-              <w:top w:w="200" w:type="dxa"/>
-              <w:left w:w="300" w:type="dxa"/>
-              <w:bottom w:w="200" w:type="dxa"/>
-              <w:right w:w="300" w:type="dxa"/>
-            </w:tcMar>
-          </w:tcPr>
-          <w:p>
-            <w:pPr>
-              <w:jc w:val="center"/>
-            </w:pPr>
-            <w:r>
-              <w:rPr>
-                <w:b/>
-                <w:bCs/>
-                <w:color w:val="2E75B6"/>
-                <w:sz w:val="24"/>
-                <w:szCs w:val="24"/>
-              </w:rPr>
-              <w:t>[ IMAGEN ]</w:t>
-            </w:r>
-          </w:p>
-          <w:p>
-            <w:pPr>
-              <w:spacing w:before="80"/>
-              <w:jc w:val="center"/>
-            </w:pPr>
-            <w:r>
-              <w:rPr>
-                <w:color w:val="555555"/>
-                <w:sz w:val="19"/>
-                <w:szCs w:val="19"/>
-              </w:rPr>
-              <w:t>Captura del formulario de contacto mostrando el mensaje de éxito (en verde) tras un envío correcto.</w:t>
-            </w:r>
-          </w:p>
-        </w:tc>
-      </w:tr>
-    </w:tbl>
+      <w:r>
+        <w:t>Demostración de la validación de campos del formulario:</w:t>
+      </w:r>
+    </w:p>
+    <w:p>
+      <w:pPr>
+        <w:spacing w:before="40"/>
+      </w:pPr>
+      <w:r>
+        <w:br/>
+      </w:r>
+      <w:r>
+        <w:drawing>
+          <wp:inline distT="0" distB="0" distL="0" distR="0" wp14:anchorId="688CB3E9" wp14:editId="7E09B2F8">
+            <wp:extent cx="6120130" cy="1122680"/>
+            <wp:effectExtent l="0" t="0" r="0" b="1270"/>
+            <wp:docPr id="628035686" name="Imagen 1"/>
+            <wp:cNvGraphicFramePr>
+              <a:graphicFrameLocks xmlns:a="http://schemas.openxmlformats.org/drawingml/2006/main" noChangeAspect="1"/>
+            </wp:cNvGraphicFramePr>
+            <a:graphic xmlns:a="http://schemas.openxmlformats.org/drawingml/2006/main">
+              <a:graphicData uri="http://schemas.openxmlformats.org/drawingml/2006/picture">
+                <pic:pic xmlns:pic="http://schemas.openxmlformats.org/drawingml/2006/picture">
+                  <pic:nvPicPr>
+                    <pic:cNvPr id="628035686" name=""/>
+                    <pic:cNvPicPr/>
+                  </pic:nvPicPr>
+                  <pic:blipFill>
+                    <a:blip r:embed="rId22"/>
+                    <a:stretch>
+                      <a:fillRect/>
+                    </a:stretch>
+                  </pic:blipFill>
+                  <pic:spPr>
+                    <a:xfrm>
+                      <a:off x="0" y="0"/>
+                      <a:ext cx="6120130" cy="1122680"/>
+                    </a:xfrm>
+                    <a:prstGeom prst="rect">
+                      <a:avLst/>
+                    </a:prstGeom>
+                  </pic:spPr>
+                </pic:pic>
+              </a:graphicData>
+            </a:graphic>
+          </wp:inline>
+        </w:drawing>
+      </w:r>
+    </w:p>
+    <w:p>
+      <w:pPr>
+        <w:spacing w:before="40"/>
+      </w:pPr>
+      <w:r>
+        <w:drawing>
+          <wp:inline distT="0" distB="0" distL="0" distR="0" wp14:anchorId="35A2ABC6" wp14:editId="57302069">
+            <wp:extent cx="6120130" cy="974090"/>
+            <wp:effectExtent l="0" t="0" r="0" b="0"/>
+            <wp:docPr id="638056591" name="Imagen 1"/>
+            <wp:cNvGraphicFramePr>
+              <a:graphicFrameLocks xmlns:a="http://schemas.openxmlformats.org/drawingml/2006/main" noChangeAspect="1"/>
+            </wp:cNvGraphicFramePr>
+            <a:graphic xmlns:a="http://schemas.openxmlformats.org/drawingml/2006/main">
+              <a:graphicData uri="http://schemas.openxmlformats.org/drawingml/2006/picture">
+                <pic:pic xmlns:pic="http://schemas.openxmlformats.org/drawingml/2006/picture">
+                  <pic:nvPicPr>
+                    <pic:cNvPr id="638056591" name=""/>
+                    <pic:cNvPicPr/>
+                  </pic:nvPicPr>
+                  <pic:blipFill>
+                    <a:blip r:embed="rId23"/>
+                    <a:stretch>
+                      <a:fillRect/>
+                    </a:stretch>
+                  </pic:blipFill>
+                  <pic:spPr>
+                    <a:xfrm>
+                      <a:off x="0" y="0"/>
+                      <a:ext cx="6120130" cy="974090"/>
+                    </a:xfrm>
+                    <a:prstGeom prst="rect">
+                      <a:avLst/>
+                    </a:prstGeom>
+                  </pic:spPr>
+                </pic:pic>
+              </a:graphicData>
+            </a:graphic>
+          </wp:inline>
+        </w:drawing>
+      </w:r>
+    </w:p>
+    <w:p>
+      <w:pPr>
+        <w:spacing w:before="40"/>
+      </w:pPr>
+      <w:r>
+        <w:drawing>
+          <wp:inline distT="0" distB="0" distL="0" distR="0" wp14:anchorId="7E95E003" wp14:editId="129F8DBE">
+            <wp:extent cx="6120130" cy="1071245"/>
+            <wp:effectExtent l="0" t="0" r="0" b="0"/>
+            <wp:docPr id="193213388" name="Imagen 1"/>
+            <wp:cNvGraphicFramePr>
+              <a:graphicFrameLocks xmlns:a="http://schemas.openxmlformats.org/drawingml/2006/main" noChangeAspect="1"/>
+            </wp:cNvGraphicFramePr>
+            <a:graphic xmlns:a="http://schemas.openxmlformats.org/drawingml/2006/main">
+              <a:graphicData uri="http://schemas.openxmlformats.org/drawingml/2006/picture">
+                <pic:pic xmlns:pic="http://schemas.openxmlformats.org/drawingml/2006/picture">
+                  <pic:nvPicPr>
+                    <pic:cNvPr id="193213388" name=""/>
+                    <pic:cNvPicPr/>
+                  </pic:nvPicPr>
+                  <pic:blipFill>
+                    <a:blip r:embed="rId24"/>
+                    <a:stretch>
+                      <a:fillRect/>
+                    </a:stretch>
+                  </pic:blipFill>
+                  <pic:spPr>
+                    <a:xfrm>
+                      <a:off x="0" y="0"/>
+                      <a:ext cx="6120130" cy="1071245"/>
+                    </a:xfrm>
+                    <a:prstGeom prst="rect">
+                      <a:avLst/>
+                    </a:prstGeom>
+                  </pic:spPr>
+                </pic:pic>
+              </a:graphicData>
+            </a:graphic>
+          </wp:inline>
+        </w:drawing>
+      </w:r>
+    </w:p>
+    <w:p>
+      <w:pPr>
+        <w:spacing w:before="40"/>
+      </w:pPr>
+      <w:r>
+        <w:drawing>
+          <wp:inline distT="0" distB="0" distL="0" distR="0" wp14:anchorId="4F96991A" wp14:editId="0E0D7397">
+            <wp:extent cx="6120130" cy="1046480"/>
+            <wp:effectExtent l="0" t="0" r="0" b="6350"/>
+            <wp:docPr id="1088434741" name="Imagen 1"/>
+            <wp:cNvGraphicFramePr>
+              <a:graphicFrameLocks xmlns:a="http://schemas.openxmlformats.org/drawingml/2006/main" noChangeAspect="1"/>
+            </wp:cNvGraphicFramePr>
+            <a:graphic xmlns:a="http://schemas.openxmlformats.org/drawingml/2006/main">
+              <a:graphicData uri="http://schemas.openxmlformats.org/drawingml/2006/picture">
+                <pic:pic xmlns:pic="http://schemas.openxmlformats.org/drawingml/2006/picture">
+                  <pic:nvPicPr>
+                    <pic:cNvPr id="1088434741" name=""/>
+                    <pic:cNvPicPr/>
+                  </pic:nvPicPr>
+                  <pic:blipFill>
+                    <a:blip r:embed="rId25"/>
+                    <a:stretch>
+                      <a:fillRect/>
+                    </a:stretch>
+                  </pic:blipFill>
+                  <pic:spPr>
+                    <a:xfrm>
+                      <a:off x="0" y="0"/>
+                      <a:ext cx="6120130" cy="1046480"/>
+                    </a:xfrm>
+                    <a:prstGeom prst="rect">
+                      <a:avLst/>
+                    </a:prstGeom>
+                  </pic:spPr>
+                </pic:pic>
+              </a:graphicData>
+            </a:graphic>
+          </wp:inline>
+        </w:drawing>
+      </w:r>
+    </w:p>
+    <w:p>
+      <w:pPr>
+        <w:spacing w:before="40"/>
+      </w:pPr>
+      <w:r>
+        <w:drawing>
+          <wp:inline distT="0" distB="0" distL="0" distR="0" wp14:anchorId="2D686D21" wp14:editId="351818DC">
+            <wp:extent cx="6120130" cy="1807845"/>
+            <wp:effectExtent l="0" t="0" r="0" b="0"/>
+            <wp:docPr id="1491050033" name="Imagen 1"/>
+            <wp:cNvGraphicFramePr>
+              <a:graphicFrameLocks xmlns:a="http://schemas.openxmlformats.org/drawingml/2006/main" noChangeAspect="1"/>
+            </wp:cNvGraphicFramePr>
+            <a:graphic xmlns:a="http://schemas.openxmlformats.org/drawingml/2006/main">
+              <a:graphicData uri="http://schemas.openxmlformats.org/drawingml/2006/picture">
+                <pic:pic xmlns:pic="http://schemas.openxmlformats.org/drawingml/2006/picture">
+                  <pic:nvPicPr>
+                    <pic:cNvPr id="1491050033" name=""/>
+                    <pic:cNvPicPr/>
+                  </pic:nvPicPr>
+                  <pic:blipFill>
+                    <a:blip r:embed="rId26"/>
+                    <a:stretch>
+                      <a:fillRect/>
+                    </a:stretch>
+                  </pic:blipFill>
+                  <pic:spPr>
+                    <a:xfrm>
+                      <a:off x="0" y="0"/>
+                      <a:ext cx="6120130" cy="1807845"/>
+                    </a:xfrm>
+                    <a:prstGeom prst="rect">
+                      <a:avLst/>
+                    </a:prstGeom>
+                  </pic:spPr>
+                </pic:pic>
+              </a:graphicData>
+            </a:graphic>
+          </wp:inline>
+        </w:drawing>
+      </w:r>
+    </w:p>
+    <w:p>
+      <w:pPr>
+        <w:spacing w:before="40"/>
+      </w:pPr>
+      <w:r>
+        <w:lastRenderedPageBreak/>
+        <w:drawing>
+          <wp:anchor distT="0" distB="0" distL="114300" distR="114300" simplePos="0" relativeHeight="251666432" behindDoc="0" locked="0" layoutInCell="1" allowOverlap="1" wp14:anchorId="7A528D52" wp14:editId="7E551F80">
+            <wp:simplePos x="0" y="0"/>
+            <wp:positionH relativeFrom="column">
+              <wp:posOffset>2997642</wp:posOffset>
+            </wp:positionH>
+            <wp:positionV relativeFrom="paragraph">
+              <wp:posOffset>231250</wp:posOffset>
+            </wp:positionV>
+            <wp:extent cx="3390182" cy="2808298"/>
+            <wp:effectExtent l="0" t="0" r="1270" b="0"/>
+            <wp:wrapSquare wrapText="bothSides"/>
+            <wp:docPr id="499669226" name="Imagen 1"/>
+            <wp:cNvGraphicFramePr>
+              <a:graphicFrameLocks xmlns:a="http://schemas.openxmlformats.org/drawingml/2006/main" noChangeAspect="1"/>
+            </wp:cNvGraphicFramePr>
+            <a:graphic xmlns:a="http://schemas.openxmlformats.org/drawingml/2006/main">
+              <a:graphicData uri="http://schemas.openxmlformats.org/drawingml/2006/picture">
+                <pic:pic xmlns:pic="http://schemas.openxmlformats.org/drawingml/2006/picture">
+                  <pic:nvPicPr>
+                    <pic:cNvPr id="499669226" name=""/>
+                    <pic:cNvPicPr/>
+                  </pic:nvPicPr>
+                  <pic:blipFill rotWithShape="1">
+                    <a:blip r:embed="rId27" cstate="print">
+                      <a:extLst>
+                        <a:ext uri="{28A0092B-C50C-407E-A947-70E740481C1C}">
+                          <a14:useLocalDpi xmlns:a14="http://schemas.microsoft.com/office/drawing/2010/main" val="0"/>
+                        </a:ext>
+                      </a:extLst>
+                    </a:blip>
+                    <a:srcRect l="16398" r="13949"/>
+                    <a:stretch>
+                      <a:fillRect/>
+                    </a:stretch>
+                  </pic:blipFill>
+                  <pic:spPr bwMode="auto">
+                    <a:xfrm>
+                      <a:off x="0" y="0"/>
+                      <a:ext cx="3390182" cy="2808298"/>
+                    </a:xfrm>
+                    <a:prstGeom prst="rect">
+                      <a:avLst/>
+                    </a:prstGeom>
+                    <a:ln>
+                      <a:noFill/>
+                    </a:ln>
+                    <a:extLst>
+                      <a:ext uri="{53640926-AAD7-44D8-BBD7-CCE9431645EC}">
+                        <a14:shadowObscured xmlns:a14="http://schemas.microsoft.com/office/drawing/2010/main"/>
+                      </a:ext>
+                    </a:extLst>
+                  </pic:spPr>
+                </pic:pic>
+              </a:graphicData>
+            </a:graphic>
+            <wp14:sizeRelH relativeFrom="page">
+              <wp14:pctWidth>0</wp14:pctWidth>
+            </wp14:sizeRelH>
+            <wp14:sizeRelV relativeFrom="page">
+              <wp14:pctHeight>0</wp14:pctHeight>
+            </wp14:sizeRelV>
+          </wp:anchor>
+        </w:drawing>
+      </w:r>
+      <w:r>
+        <w:rPr>
+          <w:noProof/>
+        </w:rPr>
+        <mc:AlternateContent>
+          <mc:Choice Requires="wps">
+            <w:drawing>
+              <wp:anchor distT="0" distB="0" distL="114300" distR="114300" simplePos="0" relativeHeight="251668480" behindDoc="0" locked="0" layoutInCell="1" allowOverlap="1" wp14:anchorId="6BB91719" wp14:editId="378BBB5D">
+                <wp:simplePos x="0" y="0"/>
+                <wp:positionH relativeFrom="column">
+                  <wp:posOffset>2453932</wp:posOffset>
+                </wp:positionH>
+                <wp:positionV relativeFrom="paragraph">
+                  <wp:posOffset>2456192</wp:posOffset>
+                </wp:positionV>
+                <wp:extent cx="283389" cy="714955"/>
+                <wp:effectExtent l="0" t="25083" r="0" b="34607"/>
+                <wp:wrapNone/>
+                <wp:docPr id="882476318" name="Flecha: hacia abajo 4"/>
+                <wp:cNvGraphicFramePr/>
+                <a:graphic xmlns:a="http://schemas.openxmlformats.org/drawingml/2006/main">
+                  <a:graphicData uri="http://schemas.microsoft.com/office/word/2010/wordprocessingShape">
+                    <wps:wsp>
+                      <wps:cNvSpPr/>
+                      <wps:spPr>
+                        <a:xfrm rot="16200000">
+                          <a:off x="0" y="0"/>
+                          <a:ext cx="283389" cy="714955"/>
+                        </a:xfrm>
+                        <a:prstGeom prst="downArrow">
+                          <a:avLst/>
+                        </a:prstGeom>
+                        <a:solidFill>
+                          <a:srgbClr val="EE0000"/>
+                        </a:solidFill>
+                        <a:ln>
+                          <a:solidFill>
+                            <a:srgbClr val="EE0000"/>
+                          </a:solidFill>
+                        </a:ln>
+                      </wps:spPr>
+                      <wps:style>
+                        <a:lnRef idx="2">
+                          <a:schemeClr val="accent1">
+                            <a:shade val="15000"/>
+                          </a:schemeClr>
+                        </a:lnRef>
+                        <a:fillRef idx="1">
+                          <a:schemeClr val="accent1"/>
+                        </a:fillRef>
+                        <a:effectRef idx="0">
+                          <a:schemeClr val="accent1"/>
+                        </a:effectRef>
+                        <a:fontRef idx="minor">
+                          <a:schemeClr val="lt1"/>
+                        </a:fontRef>
+                      </wps:style>
+                      <wps:bodyPr rot="0" spcFirstLastPara="0" vertOverflow="overflow" horzOverflow="overflow" vert="horz" wrap="square" lIns="91440" tIns="45720" rIns="91440" bIns="45720" numCol="1" spcCol="0" rtlCol="0" fromWordArt="0" anchor="ctr" anchorCtr="0" forceAA="0" compatLnSpc="1">
+                        <a:prstTxWarp prst="textNoShape">
+                          <a:avLst/>
+                        </a:prstTxWarp>
+                        <a:noAutofit/>
+                      </wps:bodyPr>
+                    </wps:wsp>
+                  </a:graphicData>
+                </a:graphic>
+                <wp14:sizeRelH relativeFrom="margin">
+                  <wp14:pctWidth>0</wp14:pctWidth>
+                </wp14:sizeRelH>
+                <wp14:sizeRelV relativeFrom="margin">
+                  <wp14:pctHeight>0</wp14:pctHeight>
+                </wp14:sizeRelV>
+              </wp:anchor>
+            </w:drawing>
+          </mc:Choice>
+          <mc:Fallback>
+            <w:pict>
+              <v:shapetype w14:anchorId="5355AF0B" id="_x0000_t67" coordsize="21600,21600" o:spt="67" adj="16200,5400" path="m0@0l@1@0@1,0@2,0@2@0,21600@0,10800,21600xe">
+                <v:stroke joinstyle="miter"/>
+                <v:formulas>
+                  <v:f eqn="val #0"/>
+                  <v:f eqn="val #1"/>
+                  <v:f eqn="sum height 0 #1"/>
+                  <v:f eqn="sum 10800 0 #1"/>
+                  <v:f eqn="sum width 0 #0"/>
+                  <v:f eqn="prod @4 @3 10800"/>
+                  <v:f eqn="sum width 0 @5"/>
+                </v:formulas>
+                <v:path o:connecttype="custom" o:connectlocs="10800,0;0,@0;10800,21600;21600,@0" o:connectangles="270,180,90,0" textboxrect="@1,0,@2,@6"/>
+                <v:handles>
+                  <v:h position="#1,#0" xrange="0,10800" yrange="0,21600"/>
+                </v:handles>
+              </v:shapetype>
+              <v:shape id="Flecha: hacia abajo 4" o:spid="_x0000_s1026" type="#_x0000_t67" style="position:absolute;margin-left:193.2pt;margin-top:193.4pt;width:22.3pt;height:56.3pt;rotation:-90;z-index:251668480;visibility:visible;mso-wrap-style:square;mso-width-percent:0;mso-height-percent:0;mso-wrap-distance-left:9pt;mso-wrap-distance-top:0;mso-wrap-distance-right:9pt;mso-wrap-distance-bottom:0;mso-position-horizontal:absolute;mso-position-horizontal-relative:text;mso-position-vertical:absolute;mso-position-vertical-relative:text;mso-width-percent:0;mso-height-percent:0;mso-width-relative:margin;mso-height-relative:margin;v-text-anchor:middle" o:gfxdata="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" adj="17319" fillcolor="#e00" strokecolor="#e00" strokeweight="1.5pt"/>
+            </w:pict>
+          </mc:Fallback>
+        </mc:AlternateContent>
+      </w:r>
+      <w:r>
+        <w:drawing>
+          <wp:anchor distT="0" distB="0" distL="114300" distR="114300" simplePos="0" relativeHeight="251667456" behindDoc="0" locked="0" layoutInCell="1" allowOverlap="1" wp14:anchorId="27F8A12B" wp14:editId="6A7D0FAE">
+            <wp:simplePos x="0" y="0"/>
+            <wp:positionH relativeFrom="margin">
+              <wp:posOffset>-379095</wp:posOffset>
+            </wp:positionH>
+            <wp:positionV relativeFrom="paragraph">
+              <wp:posOffset>259517</wp:posOffset>
+            </wp:positionV>
+            <wp:extent cx="3375025" cy="2691765"/>
+            <wp:effectExtent l="0" t="0" r="0" b="0"/>
+            <wp:wrapSquare wrapText="bothSides"/>
+            <wp:docPr id="800289658" name="Imagen 1"/>
+            <wp:cNvGraphicFramePr>
+              <a:graphicFrameLocks xmlns:a="http://schemas.openxmlformats.org/drawingml/2006/main" noChangeAspect="1"/>
+            </wp:cNvGraphicFramePr>
+            <a:graphic xmlns:a="http://schemas.openxmlformats.org/drawingml/2006/main">
+              <a:graphicData uri="http://schemas.openxmlformats.org/drawingml/2006/picture">
+                <pic:pic xmlns:pic="http://schemas.openxmlformats.org/drawingml/2006/picture">
+                  <pic:nvPicPr>
+                    <pic:cNvPr id="800289658" name=""/>
+                    <pic:cNvPicPr/>
+                  </pic:nvPicPr>
+                  <pic:blipFill rotWithShape="1">
+                    <a:blip r:embed="rId28" cstate="print">
+                      <a:extLst>
+                        <a:ext uri="{28A0092B-C50C-407E-A947-70E740481C1C}">
+                          <a14:useLocalDpi xmlns:a14="http://schemas.microsoft.com/office/drawing/2010/main" val="0"/>
+                        </a:ext>
+                      </a:extLst>
+                    </a:blip>
+                    <a:srcRect l="14709" r="13221"/>
+                    <a:stretch>
+                      <a:fillRect/>
+                    </a:stretch>
+                  </pic:blipFill>
+                  <pic:spPr bwMode="auto">
+                    <a:xfrm>
+                      <a:off x="0" y="0"/>
+                      <a:ext cx="3375025" cy="2691765"/>
+                    </a:xfrm>
+                    <a:prstGeom prst="rect">
+                      <a:avLst/>
+                    </a:prstGeom>
+                    <a:ln>
+                      <a:noFill/>
+                    </a:ln>
+                    <a:extLst>
+                      <a:ext uri="{53640926-AAD7-44D8-BBD7-CCE9431645EC}">
+                        <a14:shadowObscured xmlns:a14="http://schemas.microsoft.com/office/drawing/2010/main"/>
+                      </a:ext>
+                    </a:extLst>
+                  </pic:spPr>
+                </pic:pic>
+              </a:graphicData>
+            </a:graphic>
+            <wp14:sizeRelH relativeFrom="page">
+              <wp14:pctWidth>0</wp14:pctWidth>
+            </wp14:sizeRelH>
+            <wp14:sizeRelV relativeFrom="page">
+              <wp14:pctHeight>0</wp14:pctHeight>
+            </wp14:sizeRelV>
+          </wp:anchor>
+        </w:drawing>
+      </w:r>
+      <w:r>
+        <w:t>Ejemplo de funcionamiento del formulario:</w:t>
+      </w:r>
+    </w:p>
+    <w:p>
+      <w:pPr>
+        <w:spacing w:before="40"/>
+      </w:pPr>
+    </w:p>
     <w:p>
       <w:pPr>
         <w:spacing w:before="120"/>
       </w:pPr>
+      <w:r>
+        <w:rPr>
+          <w:noProof/>
+        </w:rPr>
+        <mc:AlternateContent>
+          <mc:Choice Requires="wps">
+            <w:drawing>
+              <wp:anchor distT="0" distB="0" distL="114300" distR="114300" simplePos="0" relativeHeight="251669504" behindDoc="0" locked="0" layoutInCell="1" allowOverlap="1" wp14:anchorId="02F2FD44" wp14:editId="42B534E9">
+                <wp:simplePos x="0" y="0"/>
+                <wp:positionH relativeFrom="column">
+                  <wp:posOffset>122748</wp:posOffset>
+                </wp:positionH>
+                <wp:positionV relativeFrom="paragraph">
+                  <wp:posOffset>1716874</wp:posOffset>
+                </wp:positionV>
+                <wp:extent cx="5343277" cy="254442"/>
+                <wp:effectExtent l="19050" t="19050" r="10160" b="12700"/>
+                <wp:wrapNone/>
+                <wp:docPr id="978653544" name="Rectángulo 5"/>
+                <wp:cNvGraphicFramePr/>
+                <a:graphic xmlns:a="http://schemas.openxmlformats.org/drawingml/2006/main">
+                  <a:graphicData uri="http://schemas.microsoft.com/office/word/2010/wordprocessingShape">
+                    <wps:wsp>
+                      <wps:cNvSpPr/>
+                      <wps:spPr>
+                        <a:xfrm>
+                          <a:off x="0" y="0"/>
+                          <a:ext cx="5343277" cy="254442"/>
+                        </a:xfrm>
+                        <a:prstGeom prst="rect">
+                          <a:avLst/>
+                        </a:prstGeom>
+                        <a:noFill/>
+                        <a:ln w="28575">
+                          <a:solidFill>
+                            <a:srgbClr val="EE0000"/>
+                          </a:solidFill>
+                        </a:ln>
+                      </wps:spPr>
+                      <wps:style>
+                        <a:lnRef idx="2">
+                          <a:schemeClr val="accent1">
+                            <a:shade val="15000"/>
+                          </a:schemeClr>
+                        </a:lnRef>
+                        <a:fillRef idx="1">
+                          <a:schemeClr val="accent1"/>
+                        </a:fillRef>
+                        <a:effectRef idx="0">
+                          <a:schemeClr val="accent1"/>
+                        </a:effectRef>
+                        <a:fontRef idx="minor">
+                          <a:schemeClr val="lt1"/>
+                        </a:fontRef>
+                      </wps:style>
+                      <wps:bodyPr rot="0" spcFirstLastPara="0" vertOverflow="overflow" horzOverflow="overflow" vert="horz" wrap="square" lIns="91440" tIns="45720" rIns="91440" bIns="45720" numCol="1" spcCol="0" rtlCol="0" fromWordArt="0" anchor="ctr" anchorCtr="0" forceAA="0" compatLnSpc="1">
+                        <a:prstTxWarp prst="textNoShape">
+                          <a:avLst/>
+                        </a:prstTxWarp>
+                        <a:noAutofit/>
+                      </wps:bodyPr>
+                    </wps:wsp>
+                  </a:graphicData>
+                </a:graphic>
+              </wp:anchor>
+            </w:drawing>
+          </mc:Choice>
+          <mc:Fallback>
+            <w:pict>
+              <v:rect w14:anchorId="31111D39" id="Rectángulo 5" o:spid="_x0000_s1026" style="position:absolute;margin-left:9.65pt;margin-top:135.2pt;width:420.75pt;height:20.05pt;z-index:251669504;visibility:visible;mso-wrap-style:square;mso-wrap-distance-left:9pt;mso-wrap-distance-top:0;mso-wrap-distance-right:9pt;mso-wrap-distance-bottom:0;mso-position-horizontal:absolute;mso-position-horizontal-relative:text;mso-position-vertical:absolute;mso-position-vertical-relative:text;v-text-anchor:middle" o:gfxdata="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" filled="f" strokecolor="#e00" strokeweight="2.25pt"/>
+            </w:pict>
+          </mc:Fallback>
+        </mc:AlternateContent>
+      </w:r>
+      <w:r>
+        <w:drawing>
+          <wp:inline distT="0" distB="0" distL="0" distR="0" wp14:anchorId="14BFED17" wp14:editId="0562705C">
+            <wp:extent cx="5822029" cy="2099144"/>
+            <wp:effectExtent l="0" t="0" r="7620" b="0"/>
+            <wp:docPr id="166695344" name="Imagen 1"/>
+            <wp:cNvGraphicFramePr>
+              <a:graphicFrameLocks xmlns:a="http://schemas.openxmlformats.org/drawingml/2006/main" noChangeAspect="1"/>
+            </wp:cNvGraphicFramePr>
+            <a:graphic xmlns:a="http://schemas.openxmlformats.org/drawingml/2006/main">
+              <a:graphicData uri="http://schemas.openxmlformats.org/drawingml/2006/picture">
+                <pic:pic xmlns:pic="http://schemas.openxmlformats.org/drawingml/2006/picture">
+                  <pic:nvPicPr>
+                    <pic:cNvPr id="166695344" name=""/>
+                    <pic:cNvPicPr/>
+                  </pic:nvPicPr>
+                  <pic:blipFill>
+                    <a:blip r:embed="rId29"/>
+                    <a:stretch>
+                      <a:fillRect/>
+                    </a:stretch>
+                  </pic:blipFill>
+                  <pic:spPr>
+                    <a:xfrm>
+                      <a:off x="0" y="0"/>
+                      <a:ext cx="5842879" cy="2106662"/>
+                    </a:xfrm>
+                    <a:prstGeom prst="rect">
+                      <a:avLst/>
+                    </a:prstGeom>
+                  </pic:spPr>
+                </pic:pic>
+              </a:graphicData>
+            </a:graphic>
+          </wp:inline>
+        </w:drawing>
+      </w:r>
     </w:p>
     <w:p>
       <w:r>
@@ -12600,12 +13161,12 @@
       <w:pPr>
         <w:pStyle w:val="Ttulo1"/>
       </w:pPr>
-      <w:bookmarkStart w:id="43" w:name="_Toc226902185"/>
+      <w:bookmarkStart w:id="42" w:name="_Toc226902185"/>
       <w:r>
         <w:lastRenderedPageBreak/>
         <w:t>5. Despliegue</w:t>
       </w:r>
-      <w:bookmarkEnd w:id="43"/>
+      <w:bookmarkEnd w:id="42"/>
     </w:p>
     <w:p>
       <w:pPr>
@@ -12619,11 +13180,11 @@
       <w:pPr>
         <w:pStyle w:val="Ttulo2"/>
       </w:pPr>
-      <w:bookmarkStart w:id="44" w:name="_Toc226902186"/>
+      <w:bookmarkStart w:id="43" w:name="_Toc226902186"/>
       <w:r>
         <w:t>5.1 Requisitos del Sistema</w:t>
       </w:r>
-      <w:bookmarkEnd w:id="44"/>
+      <w:bookmarkEnd w:id="43"/>
     </w:p>
     <w:p>
       <w:pPr>
@@ -12660,12 +13221,6 @@
         <w:gridCol w:w="6638"/>
       </w:tblGrid>
       <w:tr>
-        <w:tblPrEx>
-          <w:tblCellMar>
-            <w:top w:w="0" w:type="dxa"/>
-            <w:bottom w:w="0" w:type="dxa"/>
-          </w:tblCellMar>
-        </w:tblPrEx>
         <w:tc>
           <w:tcPr>
             <w:tcW w:w="3000" w:type="dxa"/>
@@ -12726,12 +13281,6 @@
         </w:tc>
       </w:tr>
       <w:tr>
-        <w:tblPrEx>
-          <w:tblCellMar>
-            <w:top w:w="0" w:type="dxa"/>
-            <w:bottom w:w="0" w:type="dxa"/>
-          </w:tblCellMar>
-        </w:tblPrEx>
         <w:tc>
           <w:tcPr>
             <w:tcW w:w="3000" w:type="dxa"/>
@@ -12792,12 +13341,6 @@
         </w:tc>
       </w:tr>
       <w:tr>
-        <w:tblPrEx>
-          <w:tblCellMar>
-            <w:top w:w="0" w:type="dxa"/>
-            <w:bottom w:w="0" w:type="dxa"/>
-          </w:tblCellMar>
-        </w:tblPrEx>
         <w:tc>
           <w:tcPr>
             <w:tcW w:w="3000" w:type="dxa"/>
@@ -12876,12 +13419,6 @@
         </w:tc>
       </w:tr>
       <w:tr>
-        <w:tblPrEx>
-          <w:tblCellMar>
-            <w:top w:w="0" w:type="dxa"/>
-            <w:bottom w:w="0" w:type="dxa"/>
-          </w:tblCellMar>
-        </w:tblPrEx>
         <w:tc>
           <w:tcPr>
             <w:tcW w:w="3000" w:type="dxa"/>
@@ -12942,12 +13479,6 @@
         </w:tc>
       </w:tr>
       <w:tr>
-        <w:tblPrEx>
-          <w:tblCellMar>
-            <w:top w:w="0" w:type="dxa"/>
-            <w:bottom w:w="0" w:type="dxa"/>
-          </w:tblCellMar>
-        </w:tblPrEx>
         <w:tc>
           <w:tcPr>
             <w:tcW w:w="3000" w:type="dxa"/>
@@ -13017,11 +13548,11 @@
       <w:pPr>
         <w:pStyle w:val="Ttulo2"/>
       </w:pPr>
-      <w:bookmarkStart w:id="45" w:name="_Toc226902187"/>
+      <w:bookmarkStart w:id="44" w:name="_Toc226902187"/>
       <w:r>
         <w:t>5.2 Scripts de Despliegue</w:t>
       </w:r>
-      <w:bookmarkEnd w:id="45"/>
+      <w:bookmarkEnd w:id="44"/>
     </w:p>
     <w:p>
       <w:pPr>
@@ -13045,11 +13576,11 @@
       <w:pPr>
         <w:pStyle w:val="Ttulo2"/>
       </w:pPr>
-      <w:bookmarkStart w:id="46" w:name="_Toc226902188"/>
+      <w:bookmarkStart w:id="45" w:name="_Toc226902188"/>
       <w:r>
         <w:t>5.3 Descripción del Proceso de Despliegue</w:t>
       </w:r>
-      <w:bookmarkEnd w:id="46"/>
+      <w:bookmarkEnd w:id="45"/>
     </w:p>
     <w:p>
       <w:pPr>
@@ -13073,11 +13604,11 @@
       <w:pPr>
         <w:pStyle w:val="Ttulo2"/>
       </w:pPr>
-      <w:bookmarkStart w:id="47" w:name="_Toc226902189"/>
+      <w:bookmarkStart w:id="46" w:name="_Toc226902189"/>
       <w:r>
         <w:t>5.4 Prueba Global del Despliegue</w:t>
       </w:r>
-      <w:bookmarkEnd w:id="47"/>
+      <w:bookmarkEnd w:id="46"/>
     </w:p>
     <w:p>
       <w:pPr>
@@ -13106,12 +13637,12 @@
       <w:pPr>
         <w:pStyle w:val="Ttulo1"/>
       </w:pPr>
-      <w:bookmarkStart w:id="48" w:name="_Toc226902190"/>
+      <w:bookmarkStart w:id="47" w:name="_Toc226902190"/>
       <w:r>
         <w:lastRenderedPageBreak/>
         <w:t>6. Dificultades y Soluciones</w:t>
       </w:r>
-      <w:bookmarkEnd w:id="48"/>
+      <w:bookmarkEnd w:id="47"/>
     </w:p>
     <w:p>
       <w:pPr>
@@ -13125,11 +13656,11 @@
       <w:pPr>
         <w:pStyle w:val="Ttulo2"/>
       </w:pPr>
-      <w:bookmarkStart w:id="49" w:name="_Toc226902191"/>
+      <w:bookmarkStart w:id="48" w:name="_Toc226902191"/>
       <w:r>
         <w:t>6.1 Problemas Técnicos</w:t>
       </w:r>
-      <w:bookmarkEnd w:id="49"/>
+      <w:bookmarkEnd w:id="48"/>
     </w:p>
     <w:p>
       <w:pPr>
@@ -13172,12 +13703,6 @@
         <w:gridCol w:w="3419"/>
       </w:tblGrid>
       <w:tr>
-        <w:tblPrEx>
-          <w:tblCellMar>
-            <w:top w:w="0" w:type="dxa"/>
-            <w:bottom w:w="0" w:type="dxa"/>
-          </w:tblCellMar>
-        </w:tblPrEx>
         <w:tc>
           <w:tcPr>
             <w:tcW w:w="2800" w:type="dxa"/>
@@ -13270,12 +13795,6 @@
         </w:tc>
       </w:tr>
       <w:tr>
-        <w:tblPrEx>
-          <w:tblCellMar>
-            <w:top w:w="0" w:type="dxa"/>
-            <w:bottom w:w="0" w:type="dxa"/>
-          </w:tblCellMar>
-        </w:tblPrEx>
         <w:tc>
           <w:tcPr>
             <w:tcW w:w="2800" w:type="dxa"/>
@@ -13362,12 +13881,6 @@
         </w:tc>
       </w:tr>
       <w:tr>
-        <w:tblPrEx>
-          <w:tblCellMar>
-            <w:top w:w="0" w:type="dxa"/>
-            <w:bottom w:w="0" w:type="dxa"/>
-          </w:tblCellMar>
-        </w:tblPrEx>
         <w:tc>
           <w:tcPr>
             <w:tcW w:w="2800" w:type="dxa"/>
@@ -13454,12 +13967,6 @@
         </w:tc>
       </w:tr>
       <w:tr>
-        <w:tblPrEx>
-          <w:tblCellMar>
-            <w:top w:w="0" w:type="dxa"/>
-            <w:bottom w:w="0" w:type="dxa"/>
-          </w:tblCellMar>
-        </w:tblPrEx>
         <w:tc>
           <w:tcPr>
             <w:tcW w:w="2800" w:type="dxa"/>
@@ -13555,11 +14062,11 @@
       <w:pPr>
         <w:pStyle w:val="Ttulo2"/>
       </w:pPr>
-      <w:bookmarkStart w:id="50" w:name="_Toc226902192"/>
+      <w:bookmarkStart w:id="49" w:name="_Toc226902192"/>
       <w:r>
         <w:t>6.2 Cambios de Diseño</w:t>
       </w:r>
-      <w:bookmarkEnd w:id="50"/>
+      <w:bookmarkEnd w:id="49"/>
     </w:p>
     <w:p>
       <w:pPr>
@@ -13588,12 +14095,12 @@
       <w:pPr>
         <w:pStyle w:val="Ttulo1"/>
       </w:pPr>
-      <w:bookmarkStart w:id="51" w:name="_Toc226902193"/>
+      <w:bookmarkStart w:id="50" w:name="_Toc226902193"/>
       <w:r>
         <w:lastRenderedPageBreak/>
         <w:t>7. Reparto de Tareas</w:t>
       </w:r>
-      <w:bookmarkEnd w:id="51"/>
+      <w:bookmarkEnd w:id="50"/>
     </w:p>
     <w:p>
       <w:pPr>
@@ -13607,11 +14114,11 @@
       <w:pPr>
         <w:pStyle w:val="Ttulo2"/>
       </w:pPr>
-      <w:bookmarkStart w:id="52" w:name="_Toc226902194"/>
+      <w:bookmarkStart w:id="51" w:name="_Toc226902194"/>
       <w:r>
         <w:t>7.1 Distribución del Trabajo</w:t>
       </w:r>
-      <w:bookmarkEnd w:id="52"/>
+      <w:bookmarkEnd w:id="51"/>
     </w:p>
     <w:p>
       <w:pPr>
@@ -13652,12 +14159,6 @@
         <w:gridCol w:w="3219"/>
       </w:tblGrid>
       <w:tr>
-        <w:tblPrEx>
-          <w:tblCellMar>
-            <w:top w:w="0" w:type="dxa"/>
-            <w:bottom w:w="0" w:type="dxa"/>
-          </w:tblCellMar>
-        </w:tblPrEx>
         <w:tc>
           <w:tcPr>
             <w:tcW w:w="3200" w:type="dxa"/>
@@ -13750,12 +14251,6 @@
         </w:tc>
       </w:tr>
       <w:tr>
-        <w:tblPrEx>
-          <w:tblCellMar>
-            <w:top w:w="0" w:type="dxa"/>
-            <w:bottom w:w="0" w:type="dxa"/>
-          </w:tblCellMar>
-        </w:tblPrEx>
         <w:tc>
           <w:tcPr>
             <w:tcW w:w="3200" w:type="dxa"/>
@@ -13824,12 +14319,6 @@
         </w:tc>
       </w:tr>
       <w:tr>
-        <w:tblPrEx>
-          <w:tblCellMar>
-            <w:top w:w="0" w:type="dxa"/>
-            <w:bottom w:w="0" w:type="dxa"/>
-          </w:tblCellMar>
-        </w:tblPrEx>
         <w:tc>
           <w:tcPr>
             <w:tcW w:w="3200" w:type="dxa"/>
@@ -13898,12 +14387,6 @@
         </w:tc>
       </w:tr>
       <w:tr>
-        <w:tblPrEx>
-          <w:tblCellMar>
-            <w:top w:w="0" w:type="dxa"/>
-            <w:bottom w:w="0" w:type="dxa"/>
-          </w:tblCellMar>
-        </w:tblPrEx>
         <w:tc>
           <w:tcPr>
             <w:tcW w:w="3200" w:type="dxa"/>
@@ -13972,12 +14455,6 @@
         </w:tc>
       </w:tr>
       <w:tr>
-        <w:tblPrEx>
-          <w:tblCellMar>
-            <w:top w:w="0" w:type="dxa"/>
-            <w:bottom w:w="0" w:type="dxa"/>
-          </w:tblCellMar>
-        </w:tblPrEx>
         <w:tc>
           <w:tcPr>
             <w:tcW w:w="3200" w:type="dxa"/>
@@ -14046,12 +14523,6 @@
         </w:tc>
       </w:tr>
       <w:tr>
-        <w:tblPrEx>
-          <w:tblCellMar>
-            <w:top w:w="0" w:type="dxa"/>
-            <w:bottom w:w="0" w:type="dxa"/>
-          </w:tblCellMar>
-        </w:tblPrEx>
         <w:tc>
           <w:tcPr>
             <w:tcW w:w="3200" w:type="dxa"/>
@@ -14120,12 +14591,6 @@
         </w:tc>
       </w:tr>
       <w:tr>
-        <w:tblPrEx>
-          <w:tblCellMar>
-            <w:top w:w="0" w:type="dxa"/>
-            <w:bottom w:w="0" w:type="dxa"/>
-          </w:tblCellMar>
-        </w:tblPrEx>
         <w:tc>
           <w:tcPr>
             <w:tcW w:w="3200" w:type="dxa"/>
@@ -14194,12 +14659,6 @@
         </w:tc>
       </w:tr>
       <w:tr>
-        <w:tblPrEx>
-          <w:tblCellMar>
-            <w:top w:w="0" w:type="dxa"/>
-            <w:bottom w:w="0" w:type="dxa"/>
-          </w:tblCellMar>
-        </w:tblPrEx>
         <w:tc>
           <w:tcPr>
             <w:tcW w:w="3200" w:type="dxa"/>
@@ -14268,12 +14727,6 @@
         </w:tc>
       </w:tr>
       <w:tr>
-        <w:tblPrEx>
-          <w:tblCellMar>
-            <w:top w:w="0" w:type="dxa"/>
-            <w:bottom w:w="0" w:type="dxa"/>
-          </w:tblCellMar>
-        </w:tblPrEx>
         <w:tc>
           <w:tcPr>
             <w:tcW w:w="3200" w:type="dxa"/>
@@ -14342,12 +14795,6 @@
         </w:tc>
       </w:tr>
       <w:tr>
-        <w:tblPrEx>
-          <w:tblCellMar>
-            <w:top w:w="0" w:type="dxa"/>
-            <w:bottom w:w="0" w:type="dxa"/>
-          </w:tblCellMar>
-        </w:tblPrEx>
         <w:tc>
           <w:tcPr>
             <w:tcW w:w="3200" w:type="dxa"/>
@@ -14418,34 +14865,6 @@
     </w:tbl>
     <w:p>
       <w:pPr>
-        <w:spacing w:before="80"/>
-      </w:pPr>
-    </w:p>
-    <w:p>
-      <w:pPr>
-        <w:pStyle w:val="Ttulo2"/>
-      </w:pPr>
-      <w:bookmarkStart w:id="53" w:name="_Toc226902195"/>
-      <w:r>
-        <w:t>7.2 Valoración del Trabajo en Equipo</w:t>
-      </w:r>
-      <w:bookmarkEnd w:id="53"/>
-    </w:p>
-    <w:p>
-      <w:pPr>
-        <w:spacing w:before="60" w:after="60"/>
-      </w:pPr>
-      <w:r>
-        <w:rPr>
-          <w:b/>
-          <w:bCs/>
-          <w:color w:val="CC0000"/>
-        </w:rPr>
-        <w:t>⚠ POR HACER: Redactar una valoración del trabajo en equipo: coordinación entre miembros, uso de Git/GitFlow, reuniones de seguimiento, resolución de conflictos y distribución equitativa del trabajo.</w:t>
-      </w:r>
-    </w:p>
-    <w:p>
-      <w:pPr>
         <w:spacing w:before="120"/>
       </w:pPr>
     </w:p>
@@ -14458,12 +14877,12 @@
       <w:pPr>
         <w:pStyle w:val="Ttulo1"/>
       </w:pPr>
-      <w:bookmarkStart w:id="54" w:name="_Toc226902196"/>
+      <w:bookmarkStart w:id="52" w:name="_Toc226902196"/>
       <w:r>
         <w:lastRenderedPageBreak/>
         <w:t>8. Conclusiones y Trabajo Futuro</w:t>
       </w:r>
-      <w:bookmarkEnd w:id="54"/>
+      <w:bookmarkEnd w:id="52"/>
     </w:p>
     <w:p>
       <w:pPr>
@@ -14477,11 +14896,11 @@
       <w:pPr>
         <w:pStyle w:val="Ttulo2"/>
       </w:pPr>
-      <w:bookmarkStart w:id="55" w:name="_Toc226902197"/>
+      <w:bookmarkStart w:id="53" w:name="_Toc226902197"/>
       <w:r>
         <w:t>8.1 Conclusiones</w:t>
       </w:r>
-      <w:bookmarkEnd w:id="55"/>
+      <w:bookmarkEnd w:id="53"/>
     </w:p>
     <w:p>
       <w:pPr>
@@ -14555,19 +14974,6 @@
     </w:p>
     <w:p>
       <w:pPr>
-        <w:spacing w:before="60" w:after="60"/>
-      </w:pPr>
-      <w:r>
-        <w:rPr>
-          <w:b/>
-          <w:bCs/>
-          <w:color w:val="CC0000"/>
-        </w:rPr>
-        <w:t>⚠ POR HACER: Añadir reflexión personal de cada miembro del equipo: dificultades encontradas, aprendizajes obtenidos y valoración personal del resultado final.</w:t>
-      </w:r>
-    </w:p>
-    <w:p>
-      <w:pPr>
         <w:spacing w:before="80"/>
       </w:pPr>
     </w:p>
@@ -14575,11 +14981,11 @@
       <w:pPr>
         <w:pStyle w:val="Ttulo2"/>
       </w:pPr>
-      <w:bookmarkStart w:id="56" w:name="_Toc226902198"/>
+      <w:bookmarkStart w:id="54" w:name="_Toc226902198"/>
       <w:r>
         <w:t>8.2 Trabajo Futuro</w:t>
       </w:r>
-      <w:bookmarkEnd w:id="56"/>
+      <w:bookmarkEnd w:id="54"/>
     </w:p>
     <w:p>
       <w:pPr>
@@ -14621,7 +15027,7 @@
         <w:rPr>
           <w:color w:val="000000"/>
         </w:rPr>
-        <w:t>Añadir una API REST que conecte la web con la base de datos de forma dinámica.</w:t>
+        <w:t>Incorporar gráficas de progreso del usuario en la interfaz gráfica Java.</w:t>
       </w:r>
     </w:p>
     <w:p>
@@ -14637,7 +15043,7 @@
         <w:rPr>
           <w:color w:val="000000"/>
         </w:rPr>
-        <w:t>Incorporar gráficas de progreso del usuario en la interfaz gráfica Java.</w:t>
+        <w:t>Ampliar la aplicación web con una sección de seguimiento de entrenamientos personalizada.</w:t>
       </w:r>
     </w:p>
     <w:p>
@@ -14653,7 +15059,7 @@
         <w:rPr>
           <w:color w:val="000000"/>
         </w:rPr>
-        <w:t>Ampliar la aplicación web con una sección de seguimiento de entrenamientos personalizada.</w:t>
+        <w:t>Implementar notificaciones para anuncios de clubs y próximos eventos.</w:t>
       </w:r>
     </w:p>
     <w:p>
@@ -14669,22 +15075,37 @@
         <w:rPr>
           <w:color w:val="000000"/>
         </w:rPr>
-        <w:t xml:space="preserve">Implementar notificaciones </w:t>
-      </w:r>
-      <w:proofErr w:type="spellStart"/>
-      <w:r>
-        <w:rPr>
-          <w:color w:val="000000"/>
-        </w:rPr>
-        <w:t>push</w:t>
-      </w:r>
-      <w:proofErr w:type="spellEnd"/>
-      <w:r>
-        <w:rPr>
-          <w:color w:val="000000"/>
-        </w:rPr>
-        <w:t xml:space="preserve"> para anuncios de clubs y próximos eventos.</w:t>
-      </w:r>
+        <w:t>Mejorar el despliegue con contenedores Docker para facilitar la portabilidad del sistema.</w:t>
+      </w:r>
+    </w:p>
+    <w:p>
+      <w:r>
+        <w:br w:type="page"/>
+      </w:r>
+    </w:p>
+    <w:p>
+      <w:pPr>
+        <w:pStyle w:val="Ttulo1"/>
+      </w:pPr>
+      <w:bookmarkStart w:id="55" w:name="_Toc226902199"/>
+      <w:r>
+        <w:lastRenderedPageBreak/>
+        <w:t>9. Referencias</w:t>
+      </w:r>
+      <w:bookmarkEnd w:id="55"/>
+    </w:p>
+    <w:p>
+      <w:pPr>
+        <w:pBdr>
+          <w:bottom w:val="single" w:sz="6" w:space="1" w:color="2E75B6"/>
+        </w:pBdr>
+        <w:spacing w:before="100" w:after="100"/>
+      </w:pPr>
+    </w:p>
+    <w:p>
+      <w:pPr>
+        <w:spacing w:before="40"/>
+      </w:pPr>
     </w:p>
     <w:p>
       <w:pPr>
@@ -14699,55 +15120,20 @@
         <w:rPr>
           <w:color w:val="000000"/>
         </w:rPr>
-        <w:t>Mejorar el despliegue con contenedores Docker para facilitar la portabilidad del sistema.</w:t>
-      </w:r>
-    </w:p>
-    <w:p>
-      <w:pPr>
-        <w:spacing w:before="60" w:after="60"/>
-      </w:pPr>
-      <w:r>
-        <w:rPr>
-          <w:b/>
-          <w:bCs/>
-          <w:color w:val="CC0000"/>
-        </w:rPr>
-        <w:t>⚠ POR HACER: Añadir ideas propias del equipo sobre funcionalidades que les hubiera gustado implementar.</w:t>
-      </w:r>
-    </w:p>
-    <w:p>
-      <w:pPr>
-        <w:spacing w:before="120"/>
-      </w:pPr>
-    </w:p>
-    <w:p>
-      <w:r>
-        <w:br w:type="page"/>
-      </w:r>
-    </w:p>
-    <w:p>
-      <w:pPr>
-        <w:pStyle w:val="Ttulo1"/>
-      </w:pPr>
-      <w:bookmarkStart w:id="57" w:name="_Toc226902199"/>
-      <w:r>
-        <w:lastRenderedPageBreak/>
-        <w:t>9. Referencias</w:t>
-      </w:r>
-      <w:bookmarkEnd w:id="57"/>
-    </w:p>
-    <w:p>
-      <w:pPr>
-        <w:pBdr>
-          <w:bottom w:val="single" w:sz="6" w:space="1" w:color="2E75B6"/>
-        </w:pBdr>
-        <w:spacing w:before="100" w:after="100"/>
-      </w:pPr>
-    </w:p>
-    <w:p>
-      <w:pPr>
-        <w:spacing w:before="40"/>
-      </w:pPr>
+        <w:t>MDN Web Docs — Referencia de HTML, CSS y JavaScript:</w:t>
+      </w:r>
+      <w:r>
+        <w:rPr>
+          <w:color w:val="000000"/>
+        </w:rPr>
+        <w:t xml:space="preserve"> </w:t>
+      </w:r>
+      <w:r>
+        <w:rPr>
+          <w:color w:val="000000"/>
+        </w:rPr>
+        <w:t>https://developer.mozilla.org</w:t>
+      </w:r>
     </w:p>
     <w:p>
       <w:pPr>
@@ -14762,19 +15148,7 @@
         <w:rPr>
           <w:color w:val="000000"/>
         </w:rPr>
-        <w:t>MDN Web Docs — Referencia de HTML, CSS y JavaScript:</w:t>
-      </w:r>
-      <w:r>
-        <w:rPr>
-          <w:color w:val="000000"/>
-        </w:rPr>
-        <w:t xml:space="preserve"> </w:t>
-      </w:r>
-      <w:r>
-        <w:rPr>
-          <w:color w:val="000000"/>
-        </w:rPr>
-        <w:t>https://developer.mozilla.org</w:t>
+        <w:t>Google Fonts — Tipografías web utilizadas: https://fonts.google.com</w:t>
       </w:r>
     </w:p>
     <w:p>
@@ -14790,7 +15164,7 @@
         <w:rPr>
           <w:color w:val="000000"/>
         </w:rPr>
-        <w:t>Google Fonts — Tipografías web utilizadas: https://fonts.google.com</w:t>
+        <w:t>draw.io — Herramienta para diagramas ER y UML: https://app.diagrams.net</w:t>
       </w:r>
     </w:p>
     <w:p>
@@ -14806,7 +15180,7 @@
         <w:rPr>
           <w:color w:val="000000"/>
         </w:rPr>
-        <w:t>draw.io — Herramienta para diagramas ER y UML: https://app.diagrams.net</w:t>
+        <w:t>PostgreSQL Documentation — Referencia de la base de datos: https://www.postgresql.org/docs/</w:t>
       </w:r>
     </w:p>
     <w:p>
@@ -14822,7 +15196,7 @@
         <w:rPr>
           <w:color w:val="000000"/>
         </w:rPr>
-        <w:t>PostgreSQL Documentation — Referencia de la base de datos: https://www.postgresql.org/docs/</w:t>
+        <w:t>Oracle Java Documentation — Referencia del lenguaje Java: https://docs.oracle.com/en/java/</w:t>
       </w:r>
     </w:p>
     <w:p>
@@ -14838,7 +15212,7 @@
         <w:rPr>
           <w:color w:val="000000"/>
         </w:rPr>
-        <w:t>Oracle Java Documentation — Referencia del lenguaje Java: https://docs.oracle.com/en/java/</w:t>
+        <w:t>W3Schools — Tutoriales y referencia web: https://www.w3schools.com</w:t>
       </w:r>
     </w:p>
     <w:p>
@@ -14854,7 +15228,7 @@
         <w:rPr>
           <w:color w:val="000000"/>
         </w:rPr>
-        <w:t>W3Schools — Tutoriales y referencia web: https://www.w3schools.com</w:t>
+        <w:t>Git Documentation — Control de versiones: https://git-scm.com/doc</w:t>
       </w:r>
     </w:p>
     <w:p>
@@ -14870,22 +15244,6 @@
         <w:rPr>
           <w:color w:val="000000"/>
         </w:rPr>
-        <w:t>Git Documentation — Control de versiones: https://git-scm.com/doc</w:t>
-      </w:r>
-    </w:p>
-    <w:p>
-      <w:pPr>
-        <w:pStyle w:val="Prrafodelista"/>
-        <w:numPr>
-          <w:ilvl w:val="0"/>
-          <w:numId w:val="2"/>
-        </w:numPr>
-        <w:spacing w:before="40" w:after="40"/>
-      </w:pPr>
-      <w:r>
-        <w:rPr>
-          <w:color w:val="000000"/>
-        </w:rPr>
         <w:t>GitHub — Repositorio del proyecto: POR HACER (añadir URL del repositorio)</w:t>
       </w:r>
     </w:p>
@@ -14924,8 +15282,8 @@
       </w:pPr>
     </w:p>
     <w:sectPr>
-      <w:headerReference w:type="default" r:id="rId19"/>
-      <w:footerReference w:type="default" r:id="rId20"/>
+      <w:headerReference w:type="default" r:id="rId30"/>
+      <w:footerReference w:type="default" r:id="rId31"/>
       <w:pgSz w:w="11906" w:h="16838"/>
       <w:pgMar w:top="1134" w:right="1134" w:bottom="1134" w:left="1134" w:header="708" w:footer="708" w:gutter="0"/>
       <w:cols w:space="720"/>
@@ -15143,13 +15501,41 @@
       </w:rPr>
       <w:tab/>
     </w:r>
+    <w:proofErr w:type="spellStart"/>
     <w:r>
       <w:rPr>
         <w:color w:val="777777"/>
         <w:sz w:val="18"/>
         <w:szCs w:val="18"/>
       </w:rPr>
-      <w:t>My Fit Arena</w:t>
+      <w:t>My</w:t>
+    </w:r>
+    <w:proofErr w:type="spellEnd"/>
+    <w:r>
+      <w:rPr>
+        <w:color w:val="777777"/>
+        <w:sz w:val="18"/>
+        <w:szCs w:val="18"/>
+      </w:rPr>
+      <w:t xml:space="preserve"> </w:t>
+    </w:r>
+    <w:proofErr w:type="spellStart"/>
+    <w:r>
+      <w:rPr>
+        <w:color w:val="777777"/>
+        <w:sz w:val="18"/>
+        <w:szCs w:val="18"/>
+      </w:rPr>
+      <w:t>Fit</w:t>
+    </w:r>
+    <w:proofErr w:type="spellEnd"/>
+    <w:r>
+      <w:rPr>
+        <w:color w:val="777777"/>
+        <w:sz w:val="18"/>
+        <w:szCs w:val="18"/>
+      </w:rPr>
+      <w:t xml:space="preserve"> Arena</w:t>
     </w:r>
   </w:p>
 </w:hdr>
@@ -15410,6 +15796,232 @@
       </w:rPr>
     </w:lvl>
   </w:abstractNum>
+  <w:abstractNum w:abstractNumId="3" w15:restartNumberingAfterBreak="0">
+    <w:nsid w:val="6E7B3F88"/>
+    <w:multiLevelType w:val="hybridMultilevel"/>
+    <w:tmpl w:val="2856DBD2"/>
+    <w:lvl w:ilvl="0" w:tplc="0C0A0011">
+      <w:start w:val="1"/>
+      <w:numFmt w:val="decimal"/>
+      <w:lvlText w:val="%1)"/>
+      <w:lvlJc w:val="left"/>
+      <w:pPr>
+        <w:ind w:left="720" w:hanging="360"/>
+      </w:pPr>
+      <w:rPr>
+        <w:rFonts w:hint="default"/>
+      </w:rPr>
+    </w:lvl>
+    <w:lvl w:ilvl="1" w:tplc="FFFFFFFF" w:tentative="1">
+      <w:start w:val="1"/>
+      <w:numFmt w:val="bullet"/>
+      <w:lvlText w:val="o"/>
+      <w:lvlJc w:val="left"/>
+      <w:pPr>
+        <w:ind w:left="1440" w:hanging="360"/>
+      </w:pPr>
+      <w:rPr>
+        <w:rFonts w:ascii="Courier New" w:hAnsi="Courier New" w:cs="Courier New" w:hint="default"/>
+      </w:rPr>
+    </w:lvl>
+    <w:lvl w:ilvl="2" w:tplc="FFFFFFFF" w:tentative="1">
+      <w:start w:val="1"/>
+      <w:numFmt w:val="bullet"/>
+      <w:lvlText w:val=""/>
+      <w:lvlJc w:val="left"/>
+      <w:pPr>
+        <w:ind w:left="2160" w:hanging="360"/>
+      </w:pPr>
+      <w:rPr>
+        <w:rFonts w:ascii="Wingdings" w:hAnsi="Wingdings" w:hint="default"/>
+      </w:rPr>
+    </w:lvl>
+    <w:lvl w:ilvl="3" w:tplc="FFFFFFFF" w:tentative="1">
+      <w:start w:val="1"/>
+      <w:numFmt w:val="bullet"/>
+      <w:lvlText w:val=""/>
+      <w:lvlJc w:val="left"/>
+      <w:pPr>
+        <w:ind w:left="2880" w:hanging="360"/>
+      </w:pPr>
+      <w:rPr>
+        <w:rFonts w:ascii="Symbol" w:hAnsi="Symbol" w:hint="default"/>
+      </w:rPr>
+    </w:lvl>
+    <w:lvl w:ilvl="4" w:tplc="FFFFFFFF" w:tentative="1">
+      <w:start w:val="1"/>
+      <w:numFmt w:val="bullet"/>
+      <w:lvlText w:val="o"/>
+      <w:lvlJc w:val="left"/>
+      <w:pPr>
+        <w:ind w:left="3600" w:hanging="360"/>
+      </w:pPr>
+      <w:rPr>
+        <w:rFonts w:ascii="Courier New" w:hAnsi="Courier New" w:cs="Courier New" w:hint="default"/>
+      </w:rPr>
+    </w:lvl>
+    <w:lvl w:ilvl="5" w:tplc="FFFFFFFF" w:tentative="1">
+      <w:start w:val="1"/>
+      <w:numFmt w:val="bullet"/>
+      <w:lvlText w:val=""/>
+      <w:lvlJc w:val="left"/>
+      <w:pPr>
+        <w:ind w:left="4320" w:hanging="360"/>
+      </w:pPr>
+      <w:rPr>
+        <w:rFonts w:ascii="Wingdings" w:hAnsi="Wingdings" w:hint="default"/>
+      </w:rPr>
+    </w:lvl>
+    <w:lvl w:ilvl="6" w:tplc="FFFFFFFF" w:tentative="1">
+      <w:start w:val="1"/>
+      <w:numFmt w:val="bullet"/>
+      <w:lvlText w:val=""/>
+      <w:lvlJc w:val="left"/>
+      <w:pPr>
+        <w:ind w:left="5040" w:hanging="360"/>
+      </w:pPr>
+      <w:rPr>
+        <w:rFonts w:ascii="Symbol" w:hAnsi="Symbol" w:hint="default"/>
+      </w:rPr>
+    </w:lvl>
+    <w:lvl w:ilvl="7" w:tplc="FFFFFFFF" w:tentative="1">
+      <w:start w:val="1"/>
+      <w:numFmt w:val="bullet"/>
+      <w:lvlText w:val="o"/>
+      <w:lvlJc w:val="left"/>
+      <w:pPr>
+        <w:ind w:left="5760" w:hanging="360"/>
+      </w:pPr>
+      <w:rPr>
+        <w:rFonts w:ascii="Courier New" w:hAnsi="Courier New" w:cs="Courier New" w:hint="default"/>
+      </w:rPr>
+    </w:lvl>
+    <w:lvl w:ilvl="8" w:tplc="FFFFFFFF" w:tentative="1">
+      <w:start w:val="1"/>
+      <w:numFmt w:val="bullet"/>
+      <w:lvlText w:val=""/>
+      <w:lvlJc w:val="left"/>
+      <w:pPr>
+        <w:ind w:left="6480" w:hanging="360"/>
+      </w:pPr>
+      <w:rPr>
+        <w:rFonts w:ascii="Wingdings" w:hAnsi="Wingdings" w:hint="default"/>
+      </w:rPr>
+    </w:lvl>
+  </w:abstractNum>
+  <w:abstractNum w:abstractNumId="4" w15:restartNumberingAfterBreak="0">
+    <w:nsid w:val="7E431FD0"/>
+    <w:multiLevelType w:val="hybridMultilevel"/>
+    <w:tmpl w:val="FEB8A6C4"/>
+    <w:lvl w:ilvl="0" w:tplc="0C0A000F">
+      <w:start w:val="1"/>
+      <w:numFmt w:val="decimal"/>
+      <w:lvlText w:val="%1."/>
+      <w:lvlJc w:val="left"/>
+      <w:pPr>
+        <w:ind w:left="720" w:hanging="360"/>
+      </w:pPr>
+      <w:rPr>
+        <w:rFonts w:hint="default"/>
+      </w:rPr>
+    </w:lvl>
+    <w:lvl w:ilvl="1" w:tplc="FFFFFFFF" w:tentative="1">
+      <w:start w:val="1"/>
+      <w:numFmt w:val="bullet"/>
+      <w:lvlText w:val="o"/>
+      <w:lvlJc w:val="left"/>
+      <w:pPr>
+        <w:ind w:left="1440" w:hanging="360"/>
+      </w:pPr>
+      <w:rPr>
+        <w:rFonts w:ascii="Courier New" w:hAnsi="Courier New" w:cs="Courier New" w:hint="default"/>
+      </w:rPr>
+    </w:lvl>
+    <w:lvl w:ilvl="2" w:tplc="FFFFFFFF" w:tentative="1">
+      <w:start w:val="1"/>
+      <w:numFmt w:val="bullet"/>
+      <w:lvlText w:val=""/>
+      <w:lvlJc w:val="left"/>
+      <w:pPr>
+        <w:ind w:left="2160" w:hanging="360"/>
+      </w:pPr>
+      <w:rPr>
+        <w:rFonts w:ascii="Wingdings" w:hAnsi="Wingdings" w:hint="default"/>
+      </w:rPr>
+    </w:lvl>
+    <w:lvl w:ilvl="3" w:tplc="FFFFFFFF" w:tentative="1">
+      <w:start w:val="1"/>
+      <w:numFmt w:val="bullet"/>
+      <w:lvlText w:val=""/>
+      <w:lvlJc w:val="left"/>
+      <w:pPr>
+        <w:ind w:left="2880" w:hanging="360"/>
+      </w:pPr>
+      <w:rPr>
+        <w:rFonts w:ascii="Symbol" w:hAnsi="Symbol" w:hint="default"/>
+      </w:rPr>
+    </w:lvl>
+    <w:lvl w:ilvl="4" w:tplc="FFFFFFFF" w:tentative="1">
+      <w:start w:val="1"/>
+      <w:numFmt w:val="bullet"/>
+      <w:lvlText w:val="o"/>
+      <w:lvlJc w:val="left"/>
+      <w:pPr>
+        <w:ind w:left="3600" w:hanging="360"/>
+      </w:pPr>
+      <w:rPr>
+        <w:rFonts w:ascii="Courier New" w:hAnsi="Courier New" w:cs="Courier New" w:hint="default"/>
+      </w:rPr>
+    </w:lvl>
+    <w:lvl w:ilvl="5" w:tplc="FFFFFFFF" w:tentative="1">
+      <w:start w:val="1"/>
+      <w:numFmt w:val="bullet"/>
+      <w:lvlText w:val=""/>
+      <w:lvlJc w:val="left"/>
+      <w:pPr>
+        <w:ind w:left="4320" w:hanging="360"/>
+      </w:pPr>
+      <w:rPr>
+        <w:rFonts w:ascii="Wingdings" w:hAnsi="Wingdings" w:hint="default"/>
+      </w:rPr>
+    </w:lvl>
+    <w:lvl w:ilvl="6" w:tplc="FFFFFFFF" w:tentative="1">
+      <w:start w:val="1"/>
+      <w:numFmt w:val="bullet"/>
+      <w:lvlText w:val=""/>
+      <w:lvlJc w:val="left"/>
+      <w:pPr>
+        <w:ind w:left="5040" w:hanging="360"/>
+      </w:pPr>
+      <w:rPr>
+        <w:rFonts w:ascii="Symbol" w:hAnsi="Symbol" w:hint="default"/>
+      </w:rPr>
+    </w:lvl>
+    <w:lvl w:ilvl="7" w:tplc="FFFFFFFF" w:tentative="1">
+      <w:start w:val="1"/>
+      <w:numFmt w:val="bullet"/>
+      <w:lvlText w:val="o"/>
+      <w:lvlJc w:val="left"/>
+      <w:pPr>
+        <w:ind w:left="5760" w:hanging="360"/>
+      </w:pPr>
+      <w:rPr>
+        <w:rFonts w:ascii="Courier New" w:hAnsi="Courier New" w:cs="Courier New" w:hint="default"/>
+      </w:rPr>
+    </w:lvl>
+    <w:lvl w:ilvl="8" w:tplc="FFFFFFFF" w:tentative="1">
+      <w:start w:val="1"/>
+      <w:numFmt w:val="bullet"/>
+      <w:lvlText w:val=""/>
+      <w:lvlJc w:val="left"/>
+      <w:pPr>
+        <w:ind w:left="6480" w:hanging="360"/>
+      </w:pPr>
+      <w:rPr>
+        <w:rFonts w:ascii="Wingdings" w:hAnsi="Wingdings" w:hint="default"/>
+      </w:rPr>
+    </w:lvl>
+  </w:abstractNum>
   <w:num w:numId="1" w16cid:durableId="1205875205">
     <w:abstractNumId w:val="0"/>
     <w:lvlOverride w:ilvl="0">
@@ -15424,6 +16036,12 @@
   </w:num>
   <w:num w:numId="3" w16cid:durableId="1969050004">
     <w:abstractNumId w:val="2"/>
+  </w:num>
+  <w:num w:numId="4" w16cid:durableId="787352182">
+    <w:abstractNumId w:val="4"/>
+  </w:num>
+  <w:num w:numId="5" w16cid:durableId="32309311">
+    <w:abstractNumId w:val="3"/>
   </w:num>
 </w:numbering>
 </file>

</xml_diff>